<commit_message>
create figma pages (patient and doctors)
</commit_message>
<xml_diff>
--- a/Week_1/HTTP 5310 – Capstone Requirements Document.docx
+++ b/Week_1/HTTP 5310 – Capstone Requirements Document.docx
@@ -508,15 +508,7 @@
           <w:sz w:val="28"/>
           <w:szCs w:val="28"/>
         </w:rPr>
-        <w:t>Many healthcare clinics still rely on p</w:t>
-      </w:r>
-      <w:r>
-        <w:rPr>
-          <w:rFonts w:ascii="Calibri" w:eastAsia="Calibri" w:hAnsi="Calibri" w:cs="Calibri"/>
-          <w:sz w:val="28"/>
-          <w:szCs w:val="28"/>
-        </w:rPr>
-        <w:t>hone calls or manual booking methods, which can be inconvenient for patients and staff. This project aims to explore how a web-based booking system can improve accessibility, organization, and overall user experience.</w:t>
+        <w:t>Many healthcare clinics still rely on phone calls or manual booking methods, which can be inconvenient for patients and staff. This project aims to explore how a web-based booking system can improve accessibility, organization, and overall user experience.</w:t>
       </w:r>
     </w:p>
     <w:p>
@@ -657,15 +649,7 @@
           <w:sz w:val="28"/>
           <w:szCs w:val="28"/>
         </w:rPr>
-        <w:t>This project will follow accessibility best practices and be responsive across desktop, tablet, and mob</w:t>
-      </w:r>
-      <w:r>
-        <w:rPr>
-          <w:rFonts w:ascii="Calibri" w:eastAsia="Calibri" w:hAnsi="Calibri" w:cs="Calibri"/>
-          <w:sz w:val="28"/>
-          <w:szCs w:val="28"/>
-        </w:rPr>
-        <w:t>ile devices.</w:t>
+        <w:t>This project will follow accessibility best practices and be responsive across desktop, tablet, and mobile devices.</w:t>
       </w:r>
     </w:p>
     <w:p>
@@ -1313,17 +1297,7 @@
           <w:sz w:val="28"/>
           <w:szCs w:val="28"/>
         </w:rPr>
-        <w:t>d. Content Types / Re</w:t>
-      </w:r>
-      <w:r>
-        <w:rPr>
-          <w:rFonts w:ascii="Calibri" w:eastAsia="Calibri" w:hAnsi="Calibri" w:cs="Calibri"/>
-          <w:b/>
-          <w:bCs/>
-          <w:sz w:val="28"/>
-          <w:szCs w:val="28"/>
-        </w:rPr>
-        <w:t>al-World Entities</w:t>
+        <w:t>d. Content Types / Real-World Entities</w:t>
       </w:r>
     </w:p>
     <w:p>
@@ -1584,15 +1558,7 @@
           <w:sz w:val="28"/>
           <w:szCs w:val="28"/>
         </w:rPr>
-        <w:t>As a patient, I want to create an acc</w:t>
-      </w:r>
-      <w:r>
-        <w:rPr>
-          <w:rFonts w:ascii="Calibri" w:eastAsia="Calibri" w:hAnsi="Calibri" w:cs="Calibri"/>
-          <w:sz w:val="28"/>
-          <w:szCs w:val="28"/>
-        </w:rPr>
-        <w:t>ount so that I can use the system.</w:t>
+        <w:t>As a patient, I want to create an account so that I can use the system.</w:t>
       </w:r>
     </w:p>
     <w:p>
@@ -1802,15 +1768,7 @@
           <w:sz w:val="28"/>
           <w:szCs w:val="28"/>
         </w:rPr>
-        <w:t>As a patient, I want to select a date and time so that the appointmen</w:t>
-      </w:r>
-      <w:r>
-        <w:rPr>
-          <w:rFonts w:ascii="Calibri" w:eastAsia="Calibri" w:hAnsi="Calibri" w:cs="Calibri"/>
-          <w:sz w:val="28"/>
-          <w:szCs w:val="28"/>
-        </w:rPr>
-        <w:t>t fits my schedule.</w:t>
+        <w:t>As a patient, I want to select a date and time so that the appointment fits my schedule.</w:t>
       </w:r>
     </w:p>
     <w:p>
@@ -1879,15 +1837,7 @@
           <w:sz w:val="28"/>
           <w:szCs w:val="28"/>
         </w:rPr>
-        <w:t>As a patient, I want to cancel an appointment so that the time s</w:t>
-      </w:r>
-      <w:r>
-        <w:rPr>
-          <w:rFonts w:ascii="Calibri" w:eastAsia="Calibri" w:hAnsi="Calibri" w:cs="Calibri"/>
-          <w:sz w:val="28"/>
-          <w:szCs w:val="28"/>
-        </w:rPr>
-        <w:t>lot is freed.</w:t>
+        <w:t>As a patient, I want to cancel an appointment so that the time slot is freed.</w:t>
       </w:r>
     </w:p>
     <w:p>
@@ -1900,13 +1850,16 @@
         <w:jc w:val="both"/>
         <w:rPr>
           <w:rFonts w:ascii="Calibri" w:eastAsia="Calibri" w:hAnsi="Calibri" w:cs="Calibri"/>
-          <w:sz w:val="28"/>
-          <w:szCs w:val="28"/>
-        </w:rPr>
-      </w:pPr>
-      <w:r>
-        <w:rPr>
-          <w:rFonts w:ascii="Calibri" w:eastAsia="Calibri" w:hAnsi="Calibri" w:cs="Calibri"/>
+          <w:color w:val="FF0000"/>
+          <w:sz w:val="28"/>
+          <w:szCs w:val="28"/>
+        </w:rPr>
+      </w:pPr>
+      <w:bookmarkStart w:id="11" w:name="_GoBack"/>
+      <w:r>
+        <w:rPr>
+          <w:rFonts w:ascii="Calibri" w:eastAsia="Calibri" w:hAnsi="Calibri" w:cs="Calibri"/>
+          <w:color w:val="FF0000"/>
           <w:sz w:val="28"/>
           <w:szCs w:val="28"/>
         </w:rPr>
@@ -1931,10 +1884,20 @@
       <w:r>
         <w:rPr>
           <w:rFonts w:ascii="Calibri" w:eastAsia="Calibri" w:hAnsi="Calibri" w:cs="Calibri"/>
-          <w:sz w:val="28"/>
-          <w:szCs w:val="28"/>
-        </w:rPr>
-        <w:t>As an admin, I want to prevent double bookings so that appointments do not conflict.</w:t>
+          <w:color w:val="FF0000"/>
+          <w:sz w:val="28"/>
+          <w:szCs w:val="28"/>
+        </w:rPr>
+        <w:t>As an admin, I want to prevent double bookings so that appointments do not conflict</w:t>
+      </w:r>
+      <w:bookmarkEnd w:id="11"/>
+      <w:r>
+        <w:rPr>
+          <w:rFonts w:ascii="Calibri" w:eastAsia="Calibri" w:hAnsi="Calibri" w:cs="Calibri"/>
+          <w:sz w:val="28"/>
+          <w:szCs w:val="28"/>
+        </w:rPr>
+        <w:t>.</w:t>
       </w:r>
     </w:p>
     <w:p>
@@ -1982,15 +1945,7 @@
           <w:sz w:val="28"/>
           <w:szCs w:val="28"/>
         </w:rPr>
-        <w:t>As an admin, I want to add doctor profiles so that patients can see a</w:t>
-      </w:r>
-      <w:r>
-        <w:rPr>
-          <w:rFonts w:ascii="Calibri" w:eastAsia="Calibri" w:hAnsi="Calibri" w:cs="Calibri"/>
-          <w:sz w:val="28"/>
-          <w:szCs w:val="28"/>
-        </w:rPr>
-        <w:t>vailable doctors.</w:t>
+        <w:t>As an admin, I want to add doctor profiles so that patients can see available doctors.</w:t>
       </w:r>
     </w:p>
     <w:p>
@@ -2059,15 +2014,7 @@
           <w:sz w:val="28"/>
           <w:szCs w:val="28"/>
         </w:rPr>
-        <w:t>As a patient, I want to browse doctor profiles so that I can choose a doc</w:t>
-      </w:r>
-      <w:r>
-        <w:rPr>
-          <w:rFonts w:ascii="Calibri" w:eastAsia="Calibri" w:hAnsi="Calibri" w:cs="Calibri"/>
-          <w:sz w:val="28"/>
-          <w:szCs w:val="28"/>
-        </w:rPr>
-        <w:t>tor.</w:t>
+        <w:t>As a patient, I want to browse doctor profiles so that I can choose a doctor.</w:t>
       </w:r>
     </w:p>
     <w:p>
@@ -2163,15 +2110,7 @@
           <w:szCs w:val="28"/>
         </w:rPr>
         <w:lastRenderedPageBreak/>
-        <w:t xml:space="preserve"> As an admin, I want to add services and depa</w:t>
-      </w:r>
-      <w:r>
-        <w:rPr>
-          <w:rFonts w:ascii="Calibri" w:eastAsia="Calibri" w:hAnsi="Calibri" w:cs="Calibri"/>
-          <w:sz w:val="28"/>
-          <w:szCs w:val="28"/>
-        </w:rPr>
-        <w:t>rtments so that patients know what is offered.</w:t>
+        <w:t xml:space="preserve"> As an admin, I want to add services and departments so that patients know what is offered.</w:t>
       </w:r>
     </w:p>
     <w:p>
@@ -2312,15 +2251,7 @@
           <w:sz w:val="28"/>
           <w:szCs w:val="28"/>
         </w:rPr>
-        <w:t>As an admin, I want to view all registered users so that I can manag</w:t>
-      </w:r>
-      <w:r>
-        <w:rPr>
-          <w:rFonts w:ascii="Calibri" w:eastAsia="Calibri" w:hAnsi="Calibri" w:cs="Calibri"/>
-          <w:sz w:val="28"/>
-          <w:szCs w:val="28"/>
-        </w:rPr>
-        <w:t>e accounts.</w:t>
+        <w:t>As an admin, I want to view all registered users so that I can manage accounts.</w:t>
       </w:r>
     </w:p>
     <w:p>
@@ -2389,15 +2320,7 @@
           <w:sz w:val="28"/>
           <w:szCs w:val="28"/>
         </w:rPr>
-        <w:t>As a staff member, I want to update appointment status so that records sta</w:t>
-      </w:r>
-      <w:r>
-        <w:rPr>
-          <w:rFonts w:ascii="Calibri" w:eastAsia="Calibri" w:hAnsi="Calibri" w:cs="Calibri"/>
-          <w:sz w:val="28"/>
-          <w:szCs w:val="28"/>
-        </w:rPr>
-        <w:t>y accurate.</w:t>
+        <w:t>As a staff member, I want to update appointment status so that records stay accurate.</w:t>
       </w:r>
     </w:p>
     <w:p>
@@ -2492,15 +2415,7 @@
           <w:sz w:val="28"/>
           <w:szCs w:val="28"/>
         </w:rPr>
-        <w:t>As a user, I want to see clear error messages so that I know w</w:t>
-      </w:r>
-      <w:r>
-        <w:rPr>
-          <w:rFonts w:ascii="Calibri" w:eastAsia="Calibri" w:hAnsi="Calibri" w:cs="Calibri"/>
-          <w:sz w:val="28"/>
-          <w:szCs w:val="28"/>
-        </w:rPr>
-        <w:t>hat went wrong.</w:t>
+        <w:t>As a user, I want to see clear error messages so that I know what went wrong.</w:t>
       </w:r>
     </w:p>
     <w:p>
@@ -2618,15 +2533,7 @@
           <w:sz w:val="28"/>
           <w:szCs w:val="28"/>
         </w:rPr>
-        <w:t>As</w:t>
-      </w:r>
-      <w:r>
-        <w:rPr>
-          <w:rFonts w:ascii="Calibri" w:eastAsia="Calibri" w:hAnsi="Calibri" w:cs="Calibri"/>
-          <w:sz w:val="28"/>
-          <w:szCs w:val="28"/>
-        </w:rPr>
-        <w:t xml:space="preserve"> a patient, I want appointment reminders so that I do not forget my visit.</w:t>
+        <w:t>As a patient, I want appointment reminders so that I do not forget my visit.</w:t>
       </w:r>
     </w:p>
     <w:p>
@@ -2773,8 +2680,8 @@
           <w:color w:val="000000"/>
         </w:rPr>
       </w:pPr>
-      <w:bookmarkStart w:id="11" w:name="_ceamnxq2a4ag" w:colFirst="0" w:colLast="0"/>
-      <w:bookmarkEnd w:id="11"/>
+      <w:bookmarkStart w:id="12" w:name="_ceamnxq2a4ag" w:colFirst="0" w:colLast="0"/>
+      <w:bookmarkEnd w:id="12"/>
       <w:r>
         <w:rPr>
           <w:rFonts w:ascii="Calibri" w:eastAsia="Calibri" w:hAnsi="Calibri" w:cs="Calibri"/>
@@ -3512,8 +3419,8 @@
           <w:color w:val="000000"/>
         </w:rPr>
       </w:pPr>
-      <w:bookmarkStart w:id="12" w:name="_j895jtp56bun" w:colFirst="0" w:colLast="0"/>
-      <w:bookmarkEnd w:id="12"/>
+      <w:bookmarkStart w:id="13" w:name="_j895jtp56bun" w:colFirst="0" w:colLast="0"/>
+      <w:bookmarkEnd w:id="13"/>
       <w:r>
         <w:rPr>
           <w:rFonts w:ascii="Calibri" w:eastAsia="Calibri" w:hAnsi="Calibri" w:cs="Calibri"/>
@@ -4084,10 +3991,10 @@
       </w:tr>
     </w:tbl>
     <w:p>
-      <w:bookmarkStart w:id="13" w:name="_9yy45et5dyn3" w:colFirst="0" w:colLast="0"/>
-      <w:bookmarkStart w:id="14" w:name="_pp7wntx7irzj" w:colFirst="0" w:colLast="0"/>
-      <w:bookmarkEnd w:id="13"/>
+      <w:bookmarkStart w:id="14" w:name="_9yy45et5dyn3" w:colFirst="0" w:colLast="0"/>
+      <w:bookmarkStart w:id="15" w:name="_pp7wntx7irzj" w:colFirst="0" w:colLast="0"/>
       <w:bookmarkEnd w:id="14"/>
+      <w:bookmarkEnd w:id="15"/>
     </w:p>
     <w:p/>
     <w:p/>
@@ -4110,8 +4017,8 @@
           <w:color w:val="000000"/>
         </w:rPr>
       </w:pPr>
-      <w:bookmarkStart w:id="15" w:name="_6unc4wqcz0m3" w:colFirst="0" w:colLast="0"/>
-      <w:bookmarkEnd w:id="15"/>
+      <w:bookmarkStart w:id="16" w:name="_6unc4wqcz0m3" w:colFirst="0" w:colLast="0"/>
+      <w:bookmarkEnd w:id="16"/>
       <w:r>
         <w:rPr>
           <w:rFonts w:ascii="Calibri" w:eastAsia="Calibri" w:hAnsi="Calibri" w:cs="Calibri"/>
@@ -4680,8 +4587,8 @@
           <w:color w:val="000000"/>
         </w:rPr>
       </w:pPr>
-      <w:bookmarkStart w:id="16" w:name="_wtmk82913l68" w:colFirst="0" w:colLast="0"/>
-      <w:bookmarkEnd w:id="16"/>
+      <w:bookmarkStart w:id="17" w:name="_wtmk82913l68" w:colFirst="0" w:colLast="0"/>
+      <w:bookmarkEnd w:id="17"/>
       <w:r>
         <w:rPr>
           <w:rFonts w:ascii="Calibri" w:eastAsia="Calibri" w:hAnsi="Calibri" w:cs="Calibri"/>
@@ -5275,8 +5182,8 @@
           <w:color w:val="000000"/>
         </w:rPr>
       </w:pPr>
-      <w:bookmarkStart w:id="17" w:name="_dhpm9ptz8pi" w:colFirst="0" w:colLast="0"/>
-      <w:bookmarkEnd w:id="17"/>
+      <w:bookmarkStart w:id="18" w:name="_dhpm9ptz8pi" w:colFirst="0" w:colLast="0"/>
+      <w:bookmarkEnd w:id="18"/>
     </w:p>
     <w:p>
       <w:pPr>
@@ -5859,8 +5766,8 @@
           <w:color w:val="000000"/>
         </w:rPr>
       </w:pPr>
-      <w:bookmarkStart w:id="18" w:name="_2sox8ip39pvu" w:colFirst="0" w:colLast="0"/>
-      <w:bookmarkEnd w:id="18"/>
+      <w:bookmarkStart w:id="19" w:name="_2sox8ip39pvu" w:colFirst="0" w:colLast="0"/>
+      <w:bookmarkEnd w:id="19"/>
       <w:r>
         <w:rPr>
           <w:rFonts w:ascii="Calibri" w:eastAsia="Calibri" w:hAnsi="Calibri" w:cs="Calibri"/>
@@ -6378,8 +6285,8 @@
           <w:color w:val="000000"/>
         </w:rPr>
       </w:pPr>
-      <w:bookmarkStart w:id="19" w:name="_x821z21nvcu6" w:colFirst="0" w:colLast="0"/>
-      <w:bookmarkEnd w:id="19"/>
+      <w:bookmarkStart w:id="20" w:name="_x821z21nvcu6" w:colFirst="0" w:colLast="0"/>
+      <w:bookmarkEnd w:id="20"/>
     </w:p>
     <w:p>
       <w:pPr>
@@ -6476,8 +6383,6 @@
           <w:color w:val="000000"/>
         </w:rPr>
       </w:pPr>
-      <w:bookmarkStart w:id="20" w:name="_GoBack"/>
-      <w:bookmarkEnd w:id="20"/>
       <w:r>
         <w:rPr>
           <w:rFonts w:ascii="Calibri" w:eastAsia="Calibri" w:hAnsi="Calibri" w:cs="Calibri"/>
@@ -7750,17 +7655,7 @@
           <w:sz w:val="28"/>
           <w:szCs w:val="28"/>
         </w:rPr>
-        <w:t>c. Third-Party Too</w:t>
-      </w:r>
-      <w:r>
-        <w:rPr>
-          <w:rFonts w:ascii="Calibri" w:eastAsia="Calibri" w:hAnsi="Calibri" w:cs="Calibri"/>
-          <w:b/>
-          <w:bCs/>
-          <w:sz w:val="28"/>
-          <w:szCs w:val="28"/>
-        </w:rPr>
-        <w:t>ls</w:t>
+        <w:t>c. Third-Party Tools</w:t>
       </w:r>
     </w:p>
     <w:p>
@@ -7924,15 +7819,7 @@
           <w:sz w:val="28"/>
           <w:szCs w:val="28"/>
         </w:rPr>
-        <w:t>Users interact with the interface, which sends requests to the server. The server processes the request, upda</w:t>
-      </w:r>
-      <w:r>
-        <w:rPr>
-          <w:rFonts w:ascii="Calibri" w:eastAsia="Calibri" w:hAnsi="Calibri" w:cs="Calibri"/>
-          <w:sz w:val="28"/>
-          <w:szCs w:val="28"/>
-        </w:rPr>
-        <w:t>tes the database, and returns the result to the user.</w:t>
+        <w:t>Users interact with the interface, which sends requests to the server. The server processes the request, updates the database, and returns the result to the user.</w:t>
       </w:r>
     </w:p>
     <w:p>
@@ -8641,23 +8528,7 @@
           <w:sz w:val="28"/>
           <w:szCs w:val="28"/>
         </w:rPr>
-        <w:t>HealthCare Plus is</w:t>
-      </w:r>
-      <w:r>
-        <w:rPr>
-          <w:rFonts w:ascii="Calibri" w:eastAsia="Calibri" w:hAnsi="Calibri" w:cs="Calibri"/>
-          <w:sz w:val="28"/>
-          <w:szCs w:val="28"/>
-        </w:rPr>
-        <w:t xml:space="preserve"> a project that demonstrates my understanding of web development concepts, including user stories, CRUD functionality, accessibility, and responsive design. This project allows me to apply the skills learned throughout the program in a practical and struct</w:t>
-      </w:r>
-      <w:r>
-        <w:rPr>
-          <w:rFonts w:ascii="Calibri" w:eastAsia="Calibri" w:hAnsi="Calibri" w:cs="Calibri"/>
-          <w:sz w:val="28"/>
-          <w:szCs w:val="28"/>
-        </w:rPr>
-        <w:t>ured way.</w:t>
+        <w:t>HealthCare Plus is a project that demonstrates my understanding of web development concepts, including user stories, CRUD functionality, accessibility, and responsive design. This project allows me to apply the skills learned throughout the program in a practical and structured way.</w:t>
       </w:r>
     </w:p>
     <w:p>

</xml_diff>

<commit_message>
figma prototye and revised required doc file
</commit_message>
<xml_diff>
--- a/Week_1/HTTP 5310 – Capstone Requirements Document.docx
+++ b/Week_1/HTTP 5310 – Capstone Requirements Document.docx
@@ -863,6 +863,30 @@
     </w:p>
     <w:p>
       <w:pPr>
+        <w:spacing w:after="240"/>
+        <w:ind w:right="90"/>
+        <w:jc w:val="both"/>
+        <w:rPr>
+          <w:rFonts w:ascii="Calibri" w:eastAsia="Calibri" w:hAnsi="Calibri" w:cs="Calibri"/>
+          <w:sz w:val="28"/>
+          <w:szCs w:val="28"/>
+        </w:rPr>
+      </w:pPr>
+    </w:p>
+    <w:p>
+      <w:pPr>
+        <w:spacing w:after="240"/>
+        <w:ind w:right="90"/>
+        <w:jc w:val="both"/>
+        <w:rPr>
+          <w:rFonts w:ascii="Calibri" w:eastAsia="Calibri" w:hAnsi="Calibri" w:cs="Calibri"/>
+          <w:sz w:val="28"/>
+          <w:szCs w:val="28"/>
+        </w:rPr>
+      </w:pPr>
+    </w:p>
+    <w:p>
+      <w:pPr>
         <w:spacing w:before="240" w:after="240"/>
         <w:ind w:left="720" w:right="90"/>
         <w:jc w:val="both"/>
@@ -882,6 +906,7 @@
           <w:sz w:val="28"/>
           <w:szCs w:val="28"/>
         </w:rPr>
+        <w:lastRenderedPageBreak/>
         <w:t>Dashboard Navigation (after login):</w:t>
       </w:r>
     </w:p>
@@ -929,7 +954,6 @@
           <w:sz w:val="28"/>
           <w:szCs w:val="28"/>
         </w:rPr>
-        <w:lastRenderedPageBreak/>
         <w:t>Doctor Dashboard</w:t>
       </w:r>
     </w:p>
@@ -1444,30 +1468,6 @@
         <w:jc w:val="both"/>
         <w:rPr>
           <w:rFonts w:ascii="Calibri" w:eastAsia="Calibri" w:hAnsi="Calibri" w:cs="Calibri"/>
-          <w:sz w:val="28"/>
-          <w:szCs w:val="28"/>
-        </w:rPr>
-      </w:pPr>
-    </w:p>
-    <w:p>
-      <w:pPr>
-        <w:spacing w:before="240" w:after="240"/>
-        <w:ind w:right="90"/>
-        <w:jc w:val="both"/>
-        <w:rPr>
-          <w:rFonts w:ascii="Calibri" w:eastAsia="Calibri" w:hAnsi="Calibri" w:cs="Calibri"/>
-          <w:sz w:val="28"/>
-          <w:szCs w:val="28"/>
-        </w:rPr>
-      </w:pPr>
-    </w:p>
-    <w:p>
-      <w:pPr>
-        <w:spacing w:before="240" w:after="240"/>
-        <w:ind w:right="90"/>
-        <w:jc w:val="both"/>
-        <w:rPr>
-          <w:rFonts w:ascii="Calibri" w:eastAsia="Calibri" w:hAnsi="Calibri" w:cs="Calibri"/>
           <w:b/>
           <w:bCs/>
           <w:sz w:val="28"/>
@@ -1514,7 +1514,7 @@
       <w:pPr>
         <w:numPr>
           <w:ilvl w:val="0"/>
-          <w:numId w:val="3"/>
+          <w:numId w:val="7"/>
         </w:numPr>
         <w:spacing w:before="240"/>
         <w:ind w:right="90"/>
@@ -1542,7 +1542,7 @@
       <w:pPr>
         <w:numPr>
           <w:ilvl w:val="0"/>
-          <w:numId w:val="3"/>
+          <w:numId w:val="7"/>
         </w:numPr>
         <w:ind w:right="90"/>
         <w:jc w:val="both"/>
@@ -1565,7 +1565,7 @@
       <w:pPr>
         <w:numPr>
           <w:ilvl w:val="0"/>
-          <w:numId w:val="3"/>
+          <w:numId w:val="7"/>
         </w:numPr>
         <w:ind w:right="90"/>
         <w:jc w:val="both"/>
@@ -1588,7 +1588,7 @@
       <w:pPr>
         <w:numPr>
           <w:ilvl w:val="0"/>
-          <w:numId w:val="3"/>
+          <w:numId w:val="7"/>
         </w:numPr>
         <w:ind w:right="90"/>
         <w:jc w:val="both"/>
@@ -1611,7 +1611,7 @@
       <w:pPr>
         <w:numPr>
           <w:ilvl w:val="0"/>
-          <w:numId w:val="3"/>
+          <w:numId w:val="7"/>
         </w:numPr>
         <w:ind w:right="90"/>
         <w:jc w:val="both"/>
@@ -1634,7 +1634,7 @@
       <w:pPr>
         <w:numPr>
           <w:ilvl w:val="0"/>
-          <w:numId w:val="3"/>
+          <w:numId w:val="7"/>
         </w:numPr>
         <w:ind w:right="90"/>
         <w:jc w:val="both"/>
@@ -1657,7 +1657,7 @@
       <w:pPr>
         <w:numPr>
           <w:ilvl w:val="0"/>
-          <w:numId w:val="3"/>
+          <w:numId w:val="7"/>
         </w:numPr>
         <w:spacing w:after="240"/>
         <w:ind w:right="90"/>
@@ -1679,8 +1679,13 @@
     </w:p>
     <w:p>
       <w:pPr>
+        <w:pStyle w:val="ListParagraph"/>
+        <w:numPr>
+          <w:ilvl w:val="1"/>
+          <w:numId w:val="7"/>
+        </w:numPr>
         <w:spacing w:before="240" w:after="240"/>
-        <w:ind w:left="720" w:right="90"/>
+        <w:ind w:right="90"/>
         <w:jc w:val="both"/>
         <w:rPr>
           <w:rFonts w:ascii="Calibri" w:eastAsia="Calibri" w:hAnsi="Calibri" w:cs="Calibri"/>
@@ -1705,7 +1710,7 @@
       <w:pPr>
         <w:numPr>
           <w:ilvl w:val="0"/>
-          <w:numId w:val="3"/>
+          <w:numId w:val="7"/>
         </w:numPr>
         <w:spacing w:before="240"/>
         <w:ind w:right="90"/>
@@ -1729,7 +1734,7 @@
       <w:pPr>
         <w:numPr>
           <w:ilvl w:val="0"/>
-          <w:numId w:val="3"/>
+          <w:numId w:val="7"/>
         </w:numPr>
         <w:ind w:right="90"/>
         <w:jc w:val="both"/>
@@ -1752,7 +1757,7 @@
       <w:pPr>
         <w:numPr>
           <w:ilvl w:val="0"/>
-          <w:numId w:val="3"/>
+          <w:numId w:val="7"/>
         </w:numPr>
         <w:ind w:right="90"/>
         <w:jc w:val="both"/>
@@ -1775,7 +1780,7 @@
       <w:pPr>
         <w:numPr>
           <w:ilvl w:val="0"/>
-          <w:numId w:val="3"/>
+          <w:numId w:val="7"/>
         </w:numPr>
         <w:ind w:right="90"/>
         <w:jc w:val="both"/>
@@ -1798,7 +1803,7 @@
       <w:pPr>
         <w:numPr>
           <w:ilvl w:val="0"/>
-          <w:numId w:val="3"/>
+          <w:numId w:val="7"/>
         </w:numPr>
         <w:ind w:right="90"/>
         <w:jc w:val="both"/>
@@ -1821,7 +1826,7 @@
       <w:pPr>
         <w:numPr>
           <w:ilvl w:val="0"/>
-          <w:numId w:val="3"/>
+          <w:numId w:val="7"/>
         </w:numPr>
         <w:ind w:right="90"/>
         <w:jc w:val="both"/>
@@ -1844,22 +1849,21 @@
       <w:pPr>
         <w:numPr>
           <w:ilvl w:val="0"/>
-          <w:numId w:val="3"/>
+          <w:numId w:val="7"/>
         </w:numPr>
         <w:ind w:right="90"/>
         <w:jc w:val="both"/>
         <w:rPr>
           <w:rFonts w:ascii="Calibri" w:eastAsia="Calibri" w:hAnsi="Calibri" w:cs="Calibri"/>
-          <w:color w:val="FF0000"/>
-          <w:sz w:val="28"/>
-          <w:szCs w:val="28"/>
-        </w:rPr>
-      </w:pPr>
-      <w:bookmarkStart w:id="11" w:name="_GoBack"/>
-      <w:r>
-        <w:rPr>
-          <w:rFonts w:ascii="Calibri" w:eastAsia="Calibri" w:hAnsi="Calibri" w:cs="Calibri"/>
-          <w:color w:val="FF0000"/>
+          <w:color w:val="000000" w:themeColor="text1"/>
+          <w:sz w:val="28"/>
+          <w:szCs w:val="28"/>
+        </w:rPr>
+      </w:pPr>
+      <w:r>
+        <w:rPr>
+          <w:rFonts w:ascii="Calibri" w:eastAsia="Calibri" w:hAnsi="Calibri" w:cs="Calibri"/>
+          <w:color w:val="000000" w:themeColor="text1"/>
           <w:sz w:val="28"/>
           <w:szCs w:val="28"/>
         </w:rPr>
@@ -1870,40 +1874,37 @@
       <w:pPr>
         <w:numPr>
           <w:ilvl w:val="0"/>
-          <w:numId w:val="3"/>
+          <w:numId w:val="7"/>
         </w:numPr>
         <w:spacing w:after="240"/>
         <w:ind w:right="90"/>
         <w:jc w:val="both"/>
         <w:rPr>
           <w:rFonts w:ascii="Calibri" w:eastAsia="Calibri" w:hAnsi="Calibri" w:cs="Calibri"/>
-          <w:sz w:val="28"/>
-          <w:szCs w:val="28"/>
-        </w:rPr>
-      </w:pPr>
-      <w:r>
-        <w:rPr>
-          <w:rFonts w:ascii="Calibri" w:eastAsia="Calibri" w:hAnsi="Calibri" w:cs="Calibri"/>
-          <w:color w:val="FF0000"/>
-          <w:sz w:val="28"/>
-          <w:szCs w:val="28"/>
-        </w:rPr>
-        <w:t>As an admin, I want to prevent double bookings so that appointments do not conflict</w:t>
-      </w:r>
-      <w:bookmarkEnd w:id="11"/>
-      <w:r>
-        <w:rPr>
-          <w:rFonts w:ascii="Calibri" w:eastAsia="Calibri" w:hAnsi="Calibri" w:cs="Calibri"/>
-          <w:sz w:val="28"/>
-          <w:szCs w:val="28"/>
-        </w:rPr>
-        <w:t>.</w:t>
-      </w:r>
-    </w:p>
-    <w:p>
-      <w:pPr>
+          <w:color w:val="000000" w:themeColor="text1"/>
+          <w:sz w:val="28"/>
+          <w:szCs w:val="28"/>
+        </w:rPr>
+      </w:pPr>
+      <w:r>
+        <w:rPr>
+          <w:rFonts w:ascii="Calibri" w:eastAsia="Calibri" w:hAnsi="Calibri" w:cs="Calibri"/>
+          <w:color w:val="000000" w:themeColor="text1"/>
+          <w:sz w:val="28"/>
+          <w:szCs w:val="28"/>
+        </w:rPr>
+        <w:t>As an admin, I want to prevent double bookings so that appointments do not conflict.</w:t>
+      </w:r>
+    </w:p>
+    <w:p>
+      <w:pPr>
+        <w:pStyle w:val="ListParagraph"/>
+        <w:numPr>
+          <w:ilvl w:val="1"/>
+          <w:numId w:val="7"/>
+        </w:numPr>
         <w:spacing w:before="240" w:after="240"/>
-        <w:ind w:left="720" w:right="90"/>
+        <w:ind w:right="90"/>
         <w:jc w:val="both"/>
         <w:rPr>
           <w:rFonts w:ascii="Calibri" w:eastAsia="Calibri" w:hAnsi="Calibri" w:cs="Calibri"/>
@@ -1928,7 +1929,7 @@
       <w:pPr>
         <w:numPr>
           <w:ilvl w:val="0"/>
-          <w:numId w:val="3"/>
+          <w:numId w:val="7"/>
         </w:numPr>
         <w:spacing w:before="240"/>
         <w:ind w:right="90"/>
@@ -1952,7 +1953,7 @@
       <w:pPr>
         <w:numPr>
           <w:ilvl w:val="0"/>
-          <w:numId w:val="3"/>
+          <w:numId w:val="7"/>
         </w:numPr>
         <w:ind w:right="90"/>
         <w:jc w:val="both"/>
@@ -1975,7 +1976,7 @@
       <w:pPr>
         <w:numPr>
           <w:ilvl w:val="0"/>
-          <w:numId w:val="3"/>
+          <w:numId w:val="7"/>
         </w:numPr>
         <w:ind w:right="90"/>
         <w:jc w:val="both"/>
@@ -1998,7 +1999,7 @@
       <w:pPr>
         <w:numPr>
           <w:ilvl w:val="0"/>
-          <w:numId w:val="3"/>
+          <w:numId w:val="7"/>
         </w:numPr>
         <w:ind w:right="90"/>
         <w:jc w:val="both"/>
@@ -2021,7 +2022,7 @@
       <w:pPr>
         <w:numPr>
           <w:ilvl w:val="0"/>
-          <w:numId w:val="3"/>
+          <w:numId w:val="7"/>
         </w:numPr>
         <w:ind w:right="90"/>
         <w:jc w:val="both"/>
@@ -2044,7 +2045,7 @@
       <w:pPr>
         <w:numPr>
           <w:ilvl w:val="0"/>
-          <w:numId w:val="3"/>
+          <w:numId w:val="7"/>
         </w:numPr>
         <w:spacing w:after="240"/>
         <w:ind w:right="90"/>
@@ -2066,8 +2067,13 @@
     </w:p>
     <w:p>
       <w:pPr>
+        <w:pStyle w:val="ListParagraph"/>
+        <w:numPr>
+          <w:ilvl w:val="1"/>
+          <w:numId w:val="7"/>
+        </w:numPr>
         <w:spacing w:before="240" w:after="240"/>
-        <w:ind w:left="720" w:right="90"/>
+        <w:ind w:right="90"/>
         <w:jc w:val="both"/>
         <w:rPr>
           <w:rFonts w:ascii="Calibri" w:eastAsia="Calibri" w:hAnsi="Calibri" w:cs="Calibri"/>
@@ -2092,7 +2098,7 @@
       <w:pPr>
         <w:numPr>
           <w:ilvl w:val="0"/>
-          <w:numId w:val="3"/>
+          <w:numId w:val="7"/>
         </w:numPr>
         <w:spacing w:before="240"/>
         <w:ind w:right="90"/>
@@ -2117,7 +2123,7 @@
       <w:pPr>
         <w:numPr>
           <w:ilvl w:val="0"/>
-          <w:numId w:val="3"/>
+          <w:numId w:val="7"/>
         </w:numPr>
         <w:ind w:right="90"/>
         <w:jc w:val="both"/>
@@ -2140,7 +2146,7 @@
       <w:pPr>
         <w:numPr>
           <w:ilvl w:val="0"/>
-          <w:numId w:val="3"/>
+          <w:numId w:val="7"/>
         </w:numPr>
         <w:ind w:right="90"/>
         <w:jc w:val="both"/>
@@ -2163,7 +2169,7 @@
       <w:pPr>
         <w:numPr>
           <w:ilvl w:val="0"/>
-          <w:numId w:val="3"/>
+          <w:numId w:val="7"/>
         </w:numPr>
         <w:ind w:right="90"/>
         <w:jc w:val="both"/>
@@ -2186,7 +2192,7 @@
       <w:pPr>
         <w:numPr>
           <w:ilvl w:val="0"/>
-          <w:numId w:val="3"/>
+          <w:numId w:val="7"/>
         </w:numPr>
         <w:spacing w:after="240"/>
         <w:ind w:right="90"/>
@@ -2208,8 +2214,13 @@
     </w:p>
     <w:p>
       <w:pPr>
+        <w:pStyle w:val="ListParagraph"/>
+        <w:numPr>
+          <w:ilvl w:val="1"/>
+          <w:numId w:val="7"/>
+        </w:numPr>
         <w:spacing w:before="240" w:after="240"/>
-        <w:ind w:left="720" w:right="90"/>
+        <w:ind w:right="90"/>
         <w:jc w:val="both"/>
         <w:rPr>
           <w:rFonts w:ascii="Calibri" w:eastAsia="Calibri" w:hAnsi="Calibri" w:cs="Calibri"/>
@@ -2234,7 +2245,7 @@
       <w:pPr>
         <w:numPr>
           <w:ilvl w:val="0"/>
-          <w:numId w:val="3"/>
+          <w:numId w:val="7"/>
         </w:numPr>
         <w:spacing w:before="240"/>
         <w:ind w:right="90"/>
@@ -2258,7 +2269,7 @@
       <w:pPr>
         <w:numPr>
           <w:ilvl w:val="0"/>
-          <w:numId w:val="3"/>
+          <w:numId w:val="7"/>
         </w:numPr>
         <w:ind w:right="90"/>
         <w:jc w:val="both"/>
@@ -2281,7 +2292,7 @@
       <w:pPr>
         <w:numPr>
           <w:ilvl w:val="0"/>
-          <w:numId w:val="3"/>
+          <w:numId w:val="7"/>
         </w:numPr>
         <w:ind w:right="90"/>
         <w:jc w:val="both"/>
@@ -2304,7 +2315,7 @@
       <w:pPr>
         <w:numPr>
           <w:ilvl w:val="0"/>
-          <w:numId w:val="3"/>
+          <w:numId w:val="7"/>
         </w:numPr>
         <w:ind w:right="90"/>
         <w:jc w:val="both"/>
@@ -2327,7 +2338,7 @@
       <w:pPr>
         <w:numPr>
           <w:ilvl w:val="0"/>
-          <w:numId w:val="3"/>
+          <w:numId w:val="7"/>
         </w:numPr>
         <w:spacing w:after="240"/>
         <w:ind w:right="90"/>
@@ -2349,8 +2360,13 @@
     </w:p>
     <w:p>
       <w:pPr>
+        <w:pStyle w:val="ListParagraph"/>
+        <w:numPr>
+          <w:ilvl w:val="1"/>
+          <w:numId w:val="7"/>
+        </w:numPr>
         <w:spacing w:before="240" w:after="240"/>
-        <w:ind w:left="720" w:right="90"/>
+        <w:ind w:right="90"/>
         <w:jc w:val="both"/>
         <w:rPr>
           <w:rFonts w:ascii="Calibri" w:eastAsia="Calibri" w:hAnsi="Calibri" w:cs="Calibri"/>
@@ -2375,7 +2391,7 @@
       <w:pPr>
         <w:numPr>
           <w:ilvl w:val="0"/>
-          <w:numId w:val="3"/>
+          <w:numId w:val="7"/>
         </w:numPr>
         <w:spacing w:before="240"/>
         <w:ind w:right="90"/>
@@ -2399,7 +2415,7 @@
       <w:pPr>
         <w:numPr>
           <w:ilvl w:val="0"/>
-          <w:numId w:val="3"/>
+          <w:numId w:val="7"/>
         </w:numPr>
         <w:ind w:right="90"/>
         <w:jc w:val="both"/>
@@ -2422,7 +2438,7 @@
       <w:pPr>
         <w:numPr>
           <w:ilvl w:val="0"/>
-          <w:numId w:val="3"/>
+          <w:numId w:val="7"/>
         </w:numPr>
         <w:ind w:right="90"/>
         <w:jc w:val="both"/>
@@ -2445,7 +2461,7 @@
       <w:pPr>
         <w:numPr>
           <w:ilvl w:val="0"/>
-          <w:numId w:val="3"/>
+          <w:numId w:val="7"/>
         </w:numPr>
         <w:ind w:right="90"/>
         <w:jc w:val="both"/>
@@ -2468,7 +2484,7 @@
       <w:pPr>
         <w:numPr>
           <w:ilvl w:val="0"/>
-          <w:numId w:val="3"/>
+          <w:numId w:val="7"/>
         </w:numPr>
         <w:spacing w:after="240"/>
         <w:ind w:right="90"/>
@@ -2490,8 +2506,13 @@
     </w:p>
     <w:p>
       <w:pPr>
+        <w:pStyle w:val="ListParagraph"/>
+        <w:numPr>
+          <w:ilvl w:val="1"/>
+          <w:numId w:val="7"/>
+        </w:numPr>
         <w:spacing w:before="240" w:after="240"/>
-        <w:ind w:left="720" w:right="90"/>
+        <w:ind w:right="90"/>
         <w:jc w:val="both"/>
         <w:rPr>
           <w:rFonts w:ascii="Calibri" w:eastAsia="Calibri" w:hAnsi="Calibri" w:cs="Calibri"/>
@@ -2516,7 +2537,7 @@
       <w:pPr>
         <w:numPr>
           <w:ilvl w:val="0"/>
-          <w:numId w:val="3"/>
+          <w:numId w:val="7"/>
         </w:numPr>
         <w:spacing w:before="240"/>
         <w:ind w:right="90"/>
@@ -2540,7 +2561,7 @@
       <w:pPr>
         <w:numPr>
           <w:ilvl w:val="0"/>
-          <w:numId w:val="3"/>
+          <w:numId w:val="7"/>
         </w:numPr>
         <w:ind w:right="90"/>
         <w:jc w:val="both"/>
@@ -2563,7 +2584,7 @@
       <w:pPr>
         <w:numPr>
           <w:ilvl w:val="0"/>
-          <w:numId w:val="3"/>
+          <w:numId w:val="7"/>
         </w:numPr>
         <w:ind w:right="90"/>
         <w:jc w:val="both"/>
@@ -2586,7 +2607,7 @@
       <w:pPr>
         <w:numPr>
           <w:ilvl w:val="0"/>
-          <w:numId w:val="3"/>
+          <w:numId w:val="7"/>
         </w:numPr>
         <w:ind w:right="90"/>
         <w:jc w:val="both"/>
@@ -2609,7 +2630,7 @@
       <w:pPr>
         <w:numPr>
           <w:ilvl w:val="0"/>
-          <w:numId w:val="3"/>
+          <w:numId w:val="7"/>
         </w:numPr>
         <w:spacing w:after="240"/>
         <w:ind w:right="90"/>
@@ -2628,18 +2649,6 @@
         </w:rPr>
         <w:t>As a user, I want a simple dashboard so that important information is easy to see.</w:t>
       </w:r>
-    </w:p>
-    <w:p>
-      <w:pPr>
-        <w:spacing w:before="240" w:after="240"/>
-        <w:ind w:right="90"/>
-        <w:jc w:val="both"/>
-        <w:rPr>
-          <w:rFonts w:ascii="Calibri" w:eastAsia="Calibri" w:hAnsi="Calibri" w:cs="Calibri"/>
-          <w:sz w:val="28"/>
-          <w:szCs w:val="28"/>
-        </w:rPr>
-      </w:pPr>
     </w:p>
     <w:p>
       <w:pPr>
@@ -2680,8 +2689,24 @@
           <w:color w:val="000000"/>
         </w:rPr>
       </w:pPr>
-      <w:bookmarkStart w:id="12" w:name="_ceamnxq2a4ag" w:colFirst="0" w:colLast="0"/>
-      <w:bookmarkEnd w:id="12"/>
+      <w:bookmarkStart w:id="11" w:name="_ceamnxq2a4ag" w:colFirst="0" w:colLast="0"/>
+      <w:bookmarkEnd w:id="11"/>
+    </w:p>
+    <w:p>
+      <w:pPr>
+        <w:pStyle w:val="Heading3"/>
+        <w:keepNext w:val="0"/>
+        <w:keepLines w:val="0"/>
+        <w:spacing w:before="280"/>
+        <w:ind w:right="90"/>
+        <w:jc w:val="both"/>
+        <w:rPr>
+          <w:rFonts w:ascii="Calibri" w:eastAsia="Calibri" w:hAnsi="Calibri" w:cs="Calibri"/>
+          <w:b/>
+          <w:bCs/>
+          <w:color w:val="000000"/>
+        </w:rPr>
+      </w:pPr>
       <w:r>
         <w:rPr>
           <w:rFonts w:ascii="Calibri" w:eastAsia="Calibri" w:hAnsi="Calibri" w:cs="Calibri"/>
@@ -2691,44 +2716,6 @@
         </w:rPr>
         <w:lastRenderedPageBreak/>
         <w:t>1. User Login and Registration</w:t>
-      </w:r>
-    </w:p>
-    <w:p>
-      <w:pPr>
-        <w:spacing w:before="240" w:after="240"/>
-        <w:ind w:right="90"/>
-        <w:jc w:val="both"/>
-        <w:rPr>
-          <w:rFonts w:ascii="Calibri" w:eastAsia="Calibri" w:hAnsi="Calibri" w:cs="Calibri"/>
-          <w:sz w:val="28"/>
-          <w:szCs w:val="28"/>
-        </w:rPr>
-      </w:pPr>
-      <w:r>
-        <w:rPr>
-          <w:rFonts w:ascii="Calibri" w:eastAsia="Calibri" w:hAnsi="Calibri" w:cs="Calibri"/>
-          <w:sz w:val="28"/>
-          <w:szCs w:val="28"/>
-        </w:rPr>
-        <w:t xml:space="preserve"> As a </w:t>
-      </w:r>
-      <w:r>
-        <w:rPr>
-          <w:rFonts w:ascii="Calibri" w:eastAsia="Calibri" w:hAnsi="Calibri" w:cs="Calibri"/>
-          <w:b/>
-          <w:bCs/>
-          <w:sz w:val="28"/>
-          <w:szCs w:val="28"/>
-        </w:rPr>
-        <w:t>patient</w:t>
-      </w:r>
-      <w:r>
-        <w:rPr>
-          <w:rFonts w:ascii="Calibri" w:eastAsia="Calibri" w:hAnsi="Calibri" w:cs="Calibri"/>
-          <w:sz w:val="28"/>
-          <w:szCs w:val="28"/>
-        </w:rPr>
-        <w:t>, I want to create an account and log in so that I can securely access the system.</w:t>
       </w:r>
     </w:p>
     <w:tbl>
@@ -3419,8 +3406,8 @@
           <w:color w:val="000000"/>
         </w:rPr>
       </w:pPr>
-      <w:bookmarkStart w:id="13" w:name="_j895jtp56bun" w:colFirst="0" w:colLast="0"/>
-      <w:bookmarkEnd w:id="13"/>
+      <w:bookmarkStart w:id="12" w:name="_j895jtp56bun" w:colFirst="0" w:colLast="0"/>
+      <w:bookmarkEnd w:id="12"/>
       <w:r>
         <w:rPr>
           <w:rFonts w:ascii="Calibri" w:eastAsia="Calibri" w:hAnsi="Calibri" w:cs="Calibri"/>
@@ -3429,44 +3416,6 @@
           <w:color w:val="000000"/>
         </w:rPr>
         <w:t>2. View Doctors</w:t>
-      </w:r>
-    </w:p>
-    <w:p>
-      <w:pPr>
-        <w:spacing w:before="240" w:after="240"/>
-        <w:ind w:right="90"/>
-        <w:jc w:val="both"/>
-        <w:rPr>
-          <w:rFonts w:ascii="Calibri" w:eastAsia="Calibri" w:hAnsi="Calibri" w:cs="Calibri"/>
-          <w:sz w:val="28"/>
-          <w:szCs w:val="28"/>
-        </w:rPr>
-      </w:pPr>
-      <w:r>
-        <w:rPr>
-          <w:rFonts w:ascii="Calibri" w:eastAsia="Calibri" w:hAnsi="Calibri" w:cs="Calibri"/>
-          <w:sz w:val="28"/>
-          <w:szCs w:val="28"/>
-        </w:rPr>
-        <w:t xml:space="preserve"> As a </w:t>
-      </w:r>
-      <w:r>
-        <w:rPr>
-          <w:rFonts w:ascii="Calibri" w:eastAsia="Calibri" w:hAnsi="Calibri" w:cs="Calibri"/>
-          <w:b/>
-          <w:bCs/>
-          <w:sz w:val="28"/>
-          <w:szCs w:val="28"/>
-        </w:rPr>
-        <w:t>patient</w:t>
-      </w:r>
-      <w:r>
-        <w:rPr>
-          <w:rFonts w:ascii="Calibri" w:eastAsia="Calibri" w:hAnsi="Calibri" w:cs="Calibri"/>
-          <w:sz w:val="28"/>
-          <w:szCs w:val="28"/>
-        </w:rPr>
-        <w:t>, I want to view and search doctors so that I can choose the right doctor.</w:t>
       </w:r>
     </w:p>
     <w:tbl>
@@ -3991,18 +3940,6 @@
       </w:tr>
     </w:tbl>
     <w:p>
-      <w:bookmarkStart w:id="14" w:name="_9yy45et5dyn3" w:colFirst="0" w:colLast="0"/>
-      <w:bookmarkStart w:id="15" w:name="_pp7wntx7irzj" w:colFirst="0" w:colLast="0"/>
-      <w:bookmarkEnd w:id="14"/>
-      <w:bookmarkEnd w:id="15"/>
-    </w:p>
-    <w:p/>
-    <w:p/>
-    <w:p/>
-    <w:p/>
-    <w:p/>
-    <w:p/>
-    <w:p>
       <w:pPr>
         <w:pStyle w:val="Heading3"/>
         <w:keepNext w:val="0"/>
@@ -4017,38 +3954,117 @@
           <w:color w:val="000000"/>
         </w:rPr>
       </w:pPr>
-      <w:bookmarkStart w:id="16" w:name="_6unc4wqcz0m3" w:colFirst="0" w:colLast="0"/>
-      <w:bookmarkEnd w:id="16"/>
-      <w:r>
-        <w:rPr>
-          <w:rFonts w:ascii="Calibri" w:eastAsia="Calibri" w:hAnsi="Calibri" w:cs="Calibri"/>
-          <w:b/>
-          <w:bCs/>
-          <w:color w:val="000000"/>
-        </w:rPr>
-        <w:lastRenderedPageBreak/>
-        <w:t>3. Manage Doctors (Admin)</w:t>
-      </w:r>
+      <w:bookmarkStart w:id="13" w:name="_9yy45et5dyn3" w:colFirst="0" w:colLast="0"/>
+      <w:bookmarkStart w:id="14" w:name="_pp7wntx7irzj" w:colFirst="0" w:colLast="0"/>
+      <w:bookmarkStart w:id="15" w:name="_6unc4wqcz0m3" w:colFirst="0" w:colLast="0"/>
+      <w:bookmarkEnd w:id="13"/>
+      <w:bookmarkEnd w:id="14"/>
+      <w:bookmarkEnd w:id="15"/>
     </w:p>
     <w:p>
       <w:pPr>
         <w:pStyle w:val="Heading3"/>
         <w:keepNext w:val="0"/>
         <w:keepLines w:val="0"/>
-        <w:spacing w:before="240" w:after="240"/>
+        <w:spacing w:before="280"/>
         <w:ind w:right="90"/>
         <w:jc w:val="both"/>
         <w:rPr>
           <w:rFonts w:ascii="Calibri" w:eastAsia="Calibri" w:hAnsi="Calibri" w:cs="Calibri"/>
+          <w:b/>
+          <w:bCs/>
           <w:color w:val="000000"/>
         </w:rPr>
       </w:pPr>
-      <w:r>
-        <w:rPr>
-          <w:rFonts w:ascii="Calibri" w:eastAsia="Calibri" w:hAnsi="Calibri" w:cs="Calibri"/>
+    </w:p>
+    <w:p>
+      <w:pPr>
+        <w:pStyle w:val="Heading3"/>
+        <w:keepNext w:val="0"/>
+        <w:keepLines w:val="0"/>
+        <w:spacing w:before="280"/>
+        <w:ind w:right="90"/>
+        <w:jc w:val="both"/>
+        <w:rPr>
+          <w:rFonts w:ascii="Calibri" w:eastAsia="Calibri" w:hAnsi="Calibri" w:cs="Calibri"/>
+          <w:b/>
+          <w:bCs/>
           <w:color w:val="000000"/>
         </w:rPr>
-        <w:t xml:space="preserve"> As an admin, I want to add, update, and remove doctor profiles so that doctor information stays accurate.</w:t>
+      </w:pPr>
+    </w:p>
+    <w:p>
+      <w:pPr>
+        <w:pStyle w:val="Heading3"/>
+        <w:keepNext w:val="0"/>
+        <w:keepLines w:val="0"/>
+        <w:spacing w:before="280"/>
+        <w:ind w:right="90"/>
+        <w:jc w:val="both"/>
+        <w:rPr>
+          <w:rFonts w:ascii="Calibri" w:eastAsia="Calibri" w:hAnsi="Calibri" w:cs="Calibri"/>
+          <w:b/>
+          <w:bCs/>
+          <w:color w:val="000000"/>
+        </w:rPr>
+      </w:pPr>
+    </w:p>
+    <w:p>
+      <w:pPr>
+        <w:pStyle w:val="Heading3"/>
+        <w:keepNext w:val="0"/>
+        <w:keepLines w:val="0"/>
+        <w:spacing w:before="280"/>
+        <w:ind w:right="90"/>
+        <w:jc w:val="both"/>
+        <w:rPr>
+          <w:rFonts w:ascii="Calibri" w:eastAsia="Calibri" w:hAnsi="Calibri" w:cs="Calibri"/>
+          <w:b/>
+          <w:bCs/>
+          <w:color w:val="000000"/>
+        </w:rPr>
+      </w:pPr>
+    </w:p>
+    <w:p>
+      <w:pPr>
+        <w:pStyle w:val="Heading3"/>
+        <w:keepNext w:val="0"/>
+        <w:keepLines w:val="0"/>
+        <w:spacing w:before="280"/>
+        <w:ind w:right="90"/>
+        <w:jc w:val="both"/>
+        <w:rPr>
+          <w:rFonts w:ascii="Calibri" w:eastAsia="Calibri" w:hAnsi="Calibri" w:cs="Calibri"/>
+          <w:b/>
+          <w:bCs/>
+          <w:color w:val="000000"/>
+        </w:rPr>
+      </w:pPr>
+    </w:p>
+    <w:p>
+      <w:pPr>
+        <w:pStyle w:val="Heading3"/>
+        <w:keepNext w:val="0"/>
+        <w:keepLines w:val="0"/>
+        <w:spacing w:before="280"/>
+        <w:ind w:right="90"/>
+        <w:jc w:val="both"/>
+        <w:rPr>
+          <w:rFonts w:ascii="Calibri" w:eastAsia="Calibri" w:hAnsi="Calibri" w:cs="Calibri"/>
+          <w:b/>
+          <w:bCs/>
+          <w:color w:val="000000"/>
+        </w:rPr>
+      </w:pPr>
+      <w:r>
+        <w:rPr>
+          <w:rFonts w:ascii="Calibri" w:eastAsia="Calibri" w:hAnsi="Calibri" w:cs="Calibri"/>
+          <w:b/>
+          <w:bCs/>
+          <w:color w:val="000000"/>
+        </w:rPr>
+        <w:lastRenderedPageBreak/>
+        <w:t>3. Manage Doctors (Admin)</w:t>
       </w:r>
     </w:p>
     <w:tbl>
@@ -4587,8 +4603,8 @@
           <w:color w:val="000000"/>
         </w:rPr>
       </w:pPr>
-      <w:bookmarkStart w:id="17" w:name="_wtmk82913l68" w:colFirst="0" w:colLast="0"/>
-      <w:bookmarkEnd w:id="17"/>
+      <w:bookmarkStart w:id="16" w:name="_wtmk82913l68" w:colFirst="0" w:colLast="0"/>
+      <w:bookmarkEnd w:id="16"/>
       <w:r>
         <w:rPr>
           <w:rFonts w:ascii="Calibri" w:eastAsia="Calibri" w:hAnsi="Calibri" w:cs="Calibri"/>
@@ -4606,44 +4622,6 @@
           <w:color w:val="000000"/>
         </w:rPr>
         <w:t>. Book Appointment</w:t>
-      </w:r>
-    </w:p>
-    <w:p>
-      <w:pPr>
-        <w:spacing w:before="240" w:after="240"/>
-        <w:ind w:right="90"/>
-        <w:jc w:val="both"/>
-        <w:rPr>
-          <w:rFonts w:ascii="Calibri" w:eastAsia="Calibri" w:hAnsi="Calibri" w:cs="Calibri"/>
-          <w:sz w:val="28"/>
-          <w:szCs w:val="28"/>
-        </w:rPr>
-      </w:pPr>
-      <w:r>
-        <w:rPr>
-          <w:rFonts w:ascii="Calibri" w:eastAsia="Calibri" w:hAnsi="Calibri" w:cs="Calibri"/>
-          <w:sz w:val="28"/>
-          <w:szCs w:val="28"/>
-        </w:rPr>
-        <w:t xml:space="preserve"> As a </w:t>
-      </w:r>
-      <w:r>
-        <w:rPr>
-          <w:rFonts w:ascii="Calibri" w:eastAsia="Calibri" w:hAnsi="Calibri" w:cs="Calibri"/>
-          <w:b/>
-          <w:bCs/>
-          <w:sz w:val="28"/>
-          <w:szCs w:val="28"/>
-        </w:rPr>
-        <w:t>patient</w:t>
-      </w:r>
-      <w:r>
-        <w:rPr>
-          <w:rFonts w:ascii="Calibri" w:eastAsia="Calibri" w:hAnsi="Calibri" w:cs="Calibri"/>
-          <w:sz w:val="28"/>
-          <w:szCs w:val="28"/>
-        </w:rPr>
-        <w:t>, I want to book an appointment so that I can visit a doctor.</w:t>
       </w:r>
     </w:p>
     <w:tbl>
@@ -4698,6 +4676,14 @@
             <w:r>
               <w:rPr>
                 <w:rFonts w:ascii="Calibri" w:eastAsia="Calibri" w:hAnsi="Calibri" w:cs="Calibri"/>
+                <w:sz w:val="28"/>
+                <w:szCs w:val="28"/>
+              </w:rPr>
+              <w:t xml:space="preserve"> </w:t>
+            </w:r>
+            <w:r>
+              <w:rPr>
+                <w:rFonts w:ascii="Calibri" w:eastAsia="Calibri" w:hAnsi="Calibri" w:cs="Calibri"/>
                 <w:b/>
                 <w:bCs/>
                 <w:sz w:val="28"/>
@@ -5182,128 +5168,25 @@
           <w:color w:val="000000"/>
         </w:rPr>
       </w:pPr>
-      <w:bookmarkStart w:id="18" w:name="_dhpm9ptz8pi" w:colFirst="0" w:colLast="0"/>
-      <w:bookmarkEnd w:id="18"/>
-    </w:p>
-    <w:p>
-      <w:pPr>
-        <w:pStyle w:val="Heading3"/>
-        <w:keepNext w:val="0"/>
-        <w:keepLines w:val="0"/>
-        <w:spacing w:before="280"/>
-        <w:ind w:right="90"/>
-        <w:jc w:val="both"/>
+      <w:bookmarkStart w:id="17" w:name="_dhpm9ptz8pi" w:colFirst="0" w:colLast="0"/>
+      <w:bookmarkEnd w:id="17"/>
+      <w:r>
         <w:rPr>
           <w:rFonts w:ascii="Calibri" w:eastAsia="Calibri" w:hAnsi="Calibri" w:cs="Calibri"/>
           <w:b/>
           <w:bCs/>
           <w:color w:val="000000"/>
         </w:rPr>
-      </w:pPr>
-    </w:p>
-    <w:p>
-      <w:pPr>
-        <w:pStyle w:val="Heading3"/>
-        <w:keepNext w:val="0"/>
-        <w:keepLines w:val="0"/>
-        <w:spacing w:before="280"/>
-        <w:ind w:right="90"/>
-        <w:jc w:val="both"/>
+        <w:t xml:space="preserve"> 5</w:t>
+      </w:r>
+      <w:r>
         <w:rPr>
           <w:rFonts w:ascii="Calibri" w:eastAsia="Calibri" w:hAnsi="Calibri" w:cs="Calibri"/>
           <w:b/>
           <w:bCs/>
           <w:color w:val="000000"/>
         </w:rPr>
-      </w:pPr>
-    </w:p>
-    <w:p>
-      <w:pPr>
-        <w:pStyle w:val="Heading3"/>
-        <w:keepNext w:val="0"/>
-        <w:keepLines w:val="0"/>
-        <w:spacing w:before="280"/>
-        <w:ind w:right="90"/>
-        <w:jc w:val="both"/>
-        <w:rPr>
-          <w:rFonts w:ascii="Calibri" w:eastAsia="Calibri" w:hAnsi="Calibri" w:cs="Calibri"/>
-          <w:b/>
-          <w:bCs/>
-          <w:color w:val="000000"/>
-        </w:rPr>
-      </w:pPr>
-    </w:p>
-    <w:p>
-      <w:pPr>
-        <w:pStyle w:val="Heading3"/>
-        <w:keepNext w:val="0"/>
-        <w:keepLines w:val="0"/>
-        <w:spacing w:before="280"/>
-        <w:ind w:right="90"/>
-        <w:jc w:val="both"/>
-        <w:rPr>
-          <w:rFonts w:ascii="Calibri" w:eastAsia="Calibri" w:hAnsi="Calibri" w:cs="Calibri"/>
-          <w:b/>
-          <w:bCs/>
-          <w:color w:val="000000"/>
-        </w:rPr>
-      </w:pPr>
-      <w:r>
-        <w:rPr>
-          <w:rFonts w:ascii="Calibri" w:eastAsia="Calibri" w:hAnsi="Calibri" w:cs="Calibri"/>
-          <w:b/>
-          <w:bCs/>
-          <w:color w:val="000000"/>
-        </w:rPr>
-        <w:lastRenderedPageBreak/>
-        <w:t xml:space="preserve"> 5</w:t>
-      </w:r>
-      <w:r>
-        <w:rPr>
-          <w:rFonts w:ascii="Calibri" w:eastAsia="Calibri" w:hAnsi="Calibri" w:cs="Calibri"/>
-          <w:b/>
-          <w:bCs/>
-          <w:color w:val="000000"/>
-        </w:rPr>
         <w:t>. Manage Appointments</w:t>
-      </w:r>
-    </w:p>
-    <w:p>
-      <w:pPr>
-        <w:spacing w:before="240" w:after="240"/>
-        <w:ind w:right="90"/>
-        <w:jc w:val="both"/>
-        <w:rPr>
-          <w:rFonts w:ascii="Calibri" w:eastAsia="Calibri" w:hAnsi="Calibri" w:cs="Calibri"/>
-          <w:sz w:val="28"/>
-          <w:szCs w:val="28"/>
-        </w:rPr>
-      </w:pPr>
-      <w:r>
-        <w:rPr>
-          <w:rFonts w:ascii="Calibri" w:eastAsia="Calibri" w:hAnsi="Calibri" w:cs="Calibri"/>
-          <w:sz w:val="28"/>
-          <w:szCs w:val="28"/>
-        </w:rPr>
-        <w:t xml:space="preserve"> As a </w:t>
-      </w:r>
-      <w:r>
-        <w:rPr>
-          <w:rFonts w:ascii="Calibri" w:eastAsia="Calibri" w:hAnsi="Calibri" w:cs="Calibri"/>
-          <w:b/>
-          <w:bCs/>
-          <w:sz w:val="28"/>
-          <w:szCs w:val="28"/>
-        </w:rPr>
-        <w:t>patient</w:t>
-      </w:r>
-      <w:r>
-        <w:rPr>
-          <w:rFonts w:ascii="Calibri" w:eastAsia="Calibri" w:hAnsi="Calibri" w:cs="Calibri"/>
-          <w:sz w:val="28"/>
-          <w:szCs w:val="28"/>
-        </w:rPr>
-        <w:t>, I want to view and cancel my appointments so that I can manage my schedule.</w:t>
       </w:r>
     </w:p>
     <w:tbl>
@@ -5766,15 +5649,48 @@
           <w:color w:val="000000"/>
         </w:rPr>
       </w:pPr>
-      <w:bookmarkStart w:id="19" w:name="_2sox8ip39pvu" w:colFirst="0" w:colLast="0"/>
-      <w:bookmarkEnd w:id="19"/>
-      <w:r>
+      <w:bookmarkStart w:id="18" w:name="_2sox8ip39pvu" w:colFirst="0" w:colLast="0"/>
+      <w:bookmarkEnd w:id="18"/>
+    </w:p>
+    <w:p>
+      <w:pPr>
+        <w:pStyle w:val="Heading3"/>
+        <w:keepNext w:val="0"/>
+        <w:keepLines w:val="0"/>
+        <w:spacing w:before="280"/>
+        <w:ind w:right="90"/>
+        <w:jc w:val="both"/>
         <w:rPr>
           <w:rFonts w:ascii="Calibri" w:eastAsia="Calibri" w:hAnsi="Calibri" w:cs="Calibri"/>
           <w:b/>
           <w:bCs/>
           <w:color w:val="000000"/>
         </w:rPr>
+      </w:pPr>
+    </w:p>
+    <w:p>
+      <w:pPr>
+        <w:pStyle w:val="Heading3"/>
+        <w:keepNext w:val="0"/>
+        <w:keepLines w:val="0"/>
+        <w:spacing w:before="280"/>
+        <w:ind w:right="90"/>
+        <w:jc w:val="both"/>
+        <w:rPr>
+          <w:rFonts w:ascii="Calibri" w:eastAsia="Calibri" w:hAnsi="Calibri" w:cs="Calibri"/>
+          <w:b/>
+          <w:bCs/>
+          <w:color w:val="000000"/>
+        </w:rPr>
+      </w:pPr>
+      <w:r>
+        <w:rPr>
+          <w:rFonts w:ascii="Calibri" w:eastAsia="Calibri" w:hAnsi="Calibri" w:cs="Calibri"/>
+          <w:b/>
+          <w:bCs/>
+          <w:color w:val="000000"/>
+        </w:rPr>
+        <w:lastRenderedPageBreak/>
         <w:t>6</w:t>
       </w:r>
       <w:r>
@@ -5785,44 +5701,6 @@
           <w:color w:val="000000"/>
         </w:rPr>
         <w:t>. Doctor Availability</w:t>
-      </w:r>
-    </w:p>
-    <w:p>
-      <w:pPr>
-        <w:spacing w:before="240" w:after="240"/>
-        <w:ind w:right="90"/>
-        <w:jc w:val="both"/>
-        <w:rPr>
-          <w:rFonts w:ascii="Calibri" w:eastAsia="Calibri" w:hAnsi="Calibri" w:cs="Calibri"/>
-          <w:sz w:val="28"/>
-          <w:szCs w:val="28"/>
-        </w:rPr>
-      </w:pPr>
-      <w:r>
-        <w:rPr>
-          <w:rFonts w:ascii="Calibri" w:eastAsia="Calibri" w:hAnsi="Calibri" w:cs="Calibri"/>
-          <w:sz w:val="28"/>
-          <w:szCs w:val="28"/>
-        </w:rPr>
-        <w:t xml:space="preserve"> As a </w:t>
-      </w:r>
-      <w:r>
-        <w:rPr>
-          <w:rFonts w:ascii="Calibri" w:eastAsia="Calibri" w:hAnsi="Calibri" w:cs="Calibri"/>
-          <w:b/>
-          <w:bCs/>
-          <w:sz w:val="28"/>
-          <w:szCs w:val="28"/>
-        </w:rPr>
-        <w:t>doctor</w:t>
-      </w:r>
-      <w:r>
-        <w:rPr>
-          <w:rFonts w:ascii="Calibri" w:eastAsia="Calibri" w:hAnsi="Calibri" w:cs="Calibri"/>
-          <w:sz w:val="28"/>
-          <w:szCs w:val="28"/>
-        </w:rPr>
-        <w:t>, I want to manage my available time slots so that patients can book appointments.</w:t>
       </w:r>
     </w:p>
     <w:tbl>
@@ -6285,160 +6163,25 @@
           <w:color w:val="000000"/>
         </w:rPr>
       </w:pPr>
-      <w:bookmarkStart w:id="20" w:name="_x821z21nvcu6" w:colFirst="0" w:colLast="0"/>
-      <w:bookmarkEnd w:id="20"/>
-    </w:p>
-    <w:p>
-      <w:pPr>
-        <w:pStyle w:val="Heading3"/>
-        <w:keepNext w:val="0"/>
-        <w:keepLines w:val="0"/>
-        <w:spacing w:before="280"/>
-        <w:ind w:right="90"/>
-        <w:jc w:val="both"/>
+      <w:bookmarkStart w:id="19" w:name="_x821z21nvcu6" w:colFirst="0" w:colLast="0"/>
+      <w:bookmarkEnd w:id="19"/>
+      <w:r>
         <w:rPr>
           <w:rFonts w:ascii="Calibri" w:eastAsia="Calibri" w:hAnsi="Calibri" w:cs="Calibri"/>
           <w:b/>
           <w:bCs/>
           <w:color w:val="000000"/>
         </w:rPr>
-      </w:pPr>
-    </w:p>
-    <w:p>
-      <w:pPr>
-        <w:pStyle w:val="Heading3"/>
-        <w:keepNext w:val="0"/>
-        <w:keepLines w:val="0"/>
-        <w:spacing w:before="280"/>
-        <w:ind w:right="90"/>
-        <w:jc w:val="both"/>
+        <w:t>7.</w:t>
+      </w:r>
+      <w:r>
         <w:rPr>
           <w:rFonts w:ascii="Calibri" w:eastAsia="Calibri" w:hAnsi="Calibri" w:cs="Calibri"/>
           <w:b/>
           <w:bCs/>
           <w:color w:val="000000"/>
         </w:rPr>
-      </w:pPr>
-    </w:p>
-    <w:p>
-      <w:pPr>
-        <w:pStyle w:val="Heading3"/>
-        <w:keepNext w:val="0"/>
-        <w:keepLines w:val="0"/>
-        <w:spacing w:before="280"/>
-        <w:ind w:right="90"/>
-        <w:jc w:val="both"/>
-        <w:rPr>
-          <w:rFonts w:ascii="Calibri" w:eastAsia="Calibri" w:hAnsi="Calibri" w:cs="Calibri"/>
-          <w:b/>
-          <w:bCs/>
-          <w:color w:val="000000"/>
-        </w:rPr>
-      </w:pPr>
-    </w:p>
-    <w:p>
-      <w:pPr>
-        <w:pStyle w:val="Heading3"/>
-        <w:keepNext w:val="0"/>
-        <w:keepLines w:val="0"/>
-        <w:spacing w:before="280"/>
-        <w:ind w:right="90"/>
-        <w:jc w:val="both"/>
-        <w:rPr>
-          <w:rFonts w:ascii="Calibri" w:eastAsia="Calibri" w:hAnsi="Calibri" w:cs="Calibri"/>
-          <w:b/>
-          <w:bCs/>
-          <w:color w:val="000000"/>
-        </w:rPr>
-      </w:pPr>
-    </w:p>
-    <w:p>
-      <w:pPr>
-        <w:pStyle w:val="Heading3"/>
-        <w:keepNext w:val="0"/>
-        <w:keepLines w:val="0"/>
-        <w:spacing w:before="280"/>
-        <w:ind w:right="90"/>
-        <w:jc w:val="both"/>
-        <w:rPr>
-          <w:rFonts w:ascii="Calibri" w:eastAsia="Calibri" w:hAnsi="Calibri" w:cs="Calibri"/>
-          <w:b/>
-          <w:bCs/>
-          <w:color w:val="000000"/>
-        </w:rPr>
-      </w:pPr>
-    </w:p>
-    <w:p>
-      <w:pPr>
-        <w:pStyle w:val="Heading3"/>
-        <w:keepNext w:val="0"/>
-        <w:keepLines w:val="0"/>
-        <w:spacing w:before="280"/>
-        <w:ind w:right="90"/>
-        <w:jc w:val="both"/>
-        <w:rPr>
-          <w:rFonts w:ascii="Calibri" w:eastAsia="Calibri" w:hAnsi="Calibri" w:cs="Calibri"/>
-          <w:b/>
-          <w:bCs/>
-          <w:color w:val="000000"/>
-        </w:rPr>
-      </w:pPr>
-      <w:r>
-        <w:rPr>
-          <w:rFonts w:ascii="Calibri" w:eastAsia="Calibri" w:hAnsi="Calibri" w:cs="Calibri"/>
-          <w:b/>
-          <w:bCs/>
-          <w:color w:val="000000"/>
-        </w:rPr>
-        <w:lastRenderedPageBreak/>
-        <w:t>7.</w:t>
-      </w:r>
-      <w:r>
-        <w:rPr>
-          <w:rFonts w:ascii="Calibri" w:eastAsia="Calibri" w:hAnsi="Calibri" w:cs="Calibri"/>
-          <w:b/>
-          <w:bCs/>
-          <w:color w:val="000000"/>
-        </w:rPr>
         <w:t xml:space="preserve"> Services and Departments</w:t>
-      </w:r>
-    </w:p>
-    <w:p>
-      <w:pPr>
-        <w:spacing w:before="240" w:after="240"/>
-        <w:ind w:right="90"/>
-        <w:jc w:val="both"/>
-        <w:rPr>
-          <w:rFonts w:ascii="Calibri" w:eastAsia="Calibri" w:hAnsi="Calibri" w:cs="Calibri"/>
-          <w:sz w:val="28"/>
-          <w:szCs w:val="28"/>
-        </w:rPr>
-      </w:pPr>
-      <w:r>
-        <w:rPr>
-          <w:rFonts w:ascii="Calibri" w:eastAsia="Calibri" w:hAnsi="Calibri" w:cs="Calibri"/>
-          <w:sz w:val="28"/>
-          <w:szCs w:val="28"/>
-        </w:rPr>
-        <w:t xml:space="preserve"> As a </w:t>
-      </w:r>
-      <w:r>
-        <w:rPr>
-          <w:rFonts w:ascii="Calibri" w:eastAsia="Calibri" w:hAnsi="Calibri" w:cs="Calibri"/>
-          <w:b/>
-          <w:bCs/>
-          <w:sz w:val="28"/>
-          <w:szCs w:val="28"/>
-        </w:rPr>
-        <w:t>patient</w:t>
-      </w:r>
-      <w:r>
-        <w:rPr>
-          <w:rFonts w:ascii="Calibri" w:eastAsia="Calibri" w:hAnsi="Calibri" w:cs="Calibri"/>
-          <w:sz w:val="28"/>
-          <w:szCs w:val="28"/>
-        </w:rPr>
-        <w:t>, I want to view services and departments so that I understand available healthcare options.</w:t>
       </w:r>
     </w:p>
     <w:tbl>
@@ -6888,6 +6631,1031 @@
     </w:tbl>
     <w:p>
       <w:pPr>
+        <w:spacing w:before="240" w:after="240"/>
+        <w:ind w:right="90"/>
+        <w:jc w:val="both"/>
+        <w:rPr>
+          <w:rFonts w:ascii="Calibri" w:eastAsia="Calibri" w:hAnsi="Calibri" w:cs="Calibri"/>
+          <w:b/>
+          <w:bCs/>
+          <w:color w:val="000000"/>
+          <w:sz w:val="28"/>
+          <w:szCs w:val="28"/>
+        </w:rPr>
+      </w:pPr>
+      <w:bookmarkStart w:id="20" w:name="_uxpvxeiyh60j" w:colFirst="0" w:colLast="0"/>
+      <w:bookmarkStart w:id="21" w:name="_qtuc9ys6xhga" w:colFirst="0" w:colLast="0"/>
+      <w:bookmarkStart w:id="22" w:name="_ci4qfwyn0856" w:colFirst="0" w:colLast="0"/>
+      <w:bookmarkEnd w:id="20"/>
+      <w:bookmarkEnd w:id="21"/>
+      <w:bookmarkEnd w:id="22"/>
+      <w:r>
+        <w:rPr>
+          <w:rFonts w:ascii="Calibri" w:eastAsia="Calibri" w:hAnsi="Calibri" w:cs="Calibri"/>
+          <w:b/>
+          <w:bCs/>
+          <w:color w:val="000000"/>
+          <w:sz w:val="28"/>
+          <w:szCs w:val="28"/>
+        </w:rPr>
+        <w:t>8. Admin and System Management</w:t>
+      </w:r>
+    </w:p>
+    <w:tbl>
+      <w:tblPr>
+        <w:tblW w:w="10890" w:type="dxa"/>
+        <w:tblInd w:w="-105" w:type="dxa"/>
+        <w:tblBorders>
+          <w:top w:val="single" w:sz="4" w:space="0" w:color="000000"/>
+          <w:left w:val="single" w:sz="4" w:space="0" w:color="000000"/>
+          <w:bottom w:val="single" w:sz="4" w:space="0" w:color="000000"/>
+          <w:right w:val="single" w:sz="4" w:space="0" w:color="000000"/>
+          <w:insideH w:val="single" w:sz="4" w:space="0" w:color="000000"/>
+          <w:insideV w:val="single" w:sz="4" w:space="0" w:color="000000"/>
+        </w:tblBorders>
+        <w:tblLayout w:type="fixed"/>
+        <w:tblLook w:val="0600" w:firstRow="0" w:lastRow="0" w:firstColumn="0" w:lastColumn="0" w:noHBand="1" w:noVBand="1"/>
+      </w:tblPr>
+      <w:tblGrid>
+        <w:gridCol w:w="5445"/>
+        <w:gridCol w:w="5445"/>
+      </w:tblGrid>
+      <w:tr>
+        <w:tc>
+          <w:tcPr>
+            <w:tcW w:w="5445" w:type="dxa"/>
+            <w:tcBorders>
+              <w:top w:val="single" w:sz="4" w:space="0" w:color="000000"/>
+              <w:left w:val="single" w:sz="4" w:space="0" w:color="000000"/>
+              <w:bottom w:val="single" w:sz="4" w:space="0" w:color="000000"/>
+              <w:right w:val="single" w:sz="4" w:space="0" w:color="000000"/>
+            </w:tcBorders>
+            <w:tcMar>
+              <w:top w:w="100" w:type="dxa"/>
+              <w:left w:w="100" w:type="dxa"/>
+              <w:bottom w:w="100" w:type="dxa"/>
+              <w:right w:w="100" w:type="dxa"/>
+            </w:tcMar>
+          </w:tcPr>
+          <w:p>
+            <w:pPr>
+              <w:widowControl w:val="0"/>
+              <w:spacing w:line="240" w:lineRule="auto"/>
+              <w:ind w:right="90"/>
+              <w:jc w:val="center"/>
+              <w:rPr>
+                <w:rFonts w:ascii="Calibri" w:eastAsia="Calibri" w:hAnsi="Calibri" w:cs="Calibri"/>
+                <w:sz w:val="28"/>
+                <w:szCs w:val="28"/>
+              </w:rPr>
+            </w:pPr>
+            <w:r>
+              <w:rPr>
+                <w:rFonts w:ascii="Calibri" w:eastAsia="Calibri" w:hAnsi="Calibri" w:cs="Calibri"/>
+                <w:sz w:val="28"/>
+                <w:szCs w:val="28"/>
+              </w:rPr>
+              <w:t xml:space="preserve"> </w:t>
+            </w:r>
+            <w:r>
+              <w:rPr>
+                <w:rFonts w:ascii="Calibri" w:eastAsia="Calibri" w:hAnsi="Calibri" w:cs="Calibri"/>
+                <w:b/>
+                <w:bCs/>
+                <w:sz w:val="28"/>
+                <w:szCs w:val="28"/>
+              </w:rPr>
+              <w:t>Task</w:t>
+            </w:r>
+          </w:p>
+        </w:tc>
+        <w:tc>
+          <w:tcPr>
+            <w:tcW w:w="5445" w:type="dxa"/>
+            <w:tcBorders>
+              <w:top w:val="single" w:sz="4" w:space="0" w:color="000000"/>
+              <w:left w:val="single" w:sz="4" w:space="0" w:color="000000"/>
+              <w:bottom w:val="single" w:sz="4" w:space="0" w:color="000000"/>
+              <w:right w:val="single" w:sz="4" w:space="0" w:color="000000"/>
+            </w:tcBorders>
+            <w:tcMar>
+              <w:top w:w="100" w:type="dxa"/>
+              <w:left w:w="100" w:type="dxa"/>
+              <w:bottom w:w="100" w:type="dxa"/>
+              <w:right w:w="100" w:type="dxa"/>
+            </w:tcMar>
+          </w:tcPr>
+          <w:p>
+            <w:pPr>
+              <w:widowControl w:val="0"/>
+              <w:spacing w:line="240" w:lineRule="auto"/>
+              <w:ind w:right="90"/>
+              <w:jc w:val="center"/>
+              <w:rPr>
+                <w:rFonts w:ascii="Calibri" w:eastAsia="Calibri" w:hAnsi="Calibri" w:cs="Calibri"/>
+                <w:sz w:val="28"/>
+                <w:szCs w:val="28"/>
+              </w:rPr>
+            </w:pPr>
+            <w:r>
+              <w:rPr>
+                <w:rFonts w:ascii="Calibri" w:eastAsia="Calibri" w:hAnsi="Calibri" w:cs="Calibri"/>
+                <w:b/>
+                <w:bCs/>
+                <w:sz w:val="28"/>
+                <w:szCs w:val="28"/>
+              </w:rPr>
+              <w:t>Estimated Time (</w:t>
+            </w:r>
+            <w:proofErr w:type="spellStart"/>
+            <w:r>
+              <w:rPr>
+                <w:rFonts w:ascii="Calibri" w:eastAsia="Calibri" w:hAnsi="Calibri" w:cs="Calibri"/>
+                <w:b/>
+                <w:bCs/>
+                <w:sz w:val="28"/>
+                <w:szCs w:val="28"/>
+              </w:rPr>
+              <w:t>hrs</w:t>
+            </w:r>
+            <w:proofErr w:type="spellEnd"/>
+            <w:r>
+              <w:rPr>
+                <w:rFonts w:ascii="Calibri" w:eastAsia="Calibri" w:hAnsi="Calibri" w:cs="Calibri"/>
+                <w:b/>
+                <w:bCs/>
+                <w:sz w:val="28"/>
+                <w:szCs w:val="28"/>
+              </w:rPr>
+              <w:t>)</w:t>
+            </w:r>
+          </w:p>
+        </w:tc>
+      </w:tr>
+      <w:tr>
+        <w:tc>
+          <w:tcPr>
+            <w:tcW w:w="5445" w:type="dxa"/>
+            <w:tcBorders>
+              <w:top w:val="single" w:sz="4" w:space="0" w:color="000000"/>
+              <w:left w:val="single" w:sz="4" w:space="0" w:color="000000"/>
+              <w:bottom w:val="single" w:sz="4" w:space="0" w:color="000000"/>
+              <w:right w:val="single" w:sz="4" w:space="0" w:color="000000"/>
+            </w:tcBorders>
+            <w:tcMar>
+              <w:top w:w="100" w:type="dxa"/>
+              <w:left w:w="100" w:type="dxa"/>
+              <w:bottom w:w="100" w:type="dxa"/>
+              <w:right w:w="100" w:type="dxa"/>
+            </w:tcMar>
+          </w:tcPr>
+          <w:p>
+            <w:pPr>
+              <w:widowControl w:val="0"/>
+              <w:spacing w:line="240" w:lineRule="auto"/>
+              <w:ind w:right="90"/>
+              <w:rPr>
+                <w:rFonts w:ascii="Calibri" w:eastAsia="Calibri" w:hAnsi="Calibri" w:cs="Calibri"/>
+                <w:sz w:val="28"/>
+                <w:szCs w:val="28"/>
+              </w:rPr>
+            </w:pPr>
+            <w:r>
+              <w:rPr>
+                <w:rFonts w:ascii="Calibri" w:eastAsia="Calibri" w:hAnsi="Calibri" w:cs="Calibri"/>
+                <w:sz w:val="28"/>
+                <w:szCs w:val="28"/>
+              </w:rPr>
+              <w:t>User list page</w:t>
+            </w:r>
+          </w:p>
+        </w:tc>
+        <w:tc>
+          <w:tcPr>
+            <w:tcW w:w="5445" w:type="dxa"/>
+            <w:tcBorders>
+              <w:top w:val="single" w:sz="4" w:space="0" w:color="000000"/>
+              <w:left w:val="single" w:sz="4" w:space="0" w:color="000000"/>
+              <w:bottom w:val="single" w:sz="4" w:space="0" w:color="000000"/>
+              <w:right w:val="single" w:sz="4" w:space="0" w:color="000000"/>
+            </w:tcBorders>
+            <w:tcMar>
+              <w:top w:w="100" w:type="dxa"/>
+              <w:left w:w="100" w:type="dxa"/>
+              <w:bottom w:w="100" w:type="dxa"/>
+              <w:right w:w="100" w:type="dxa"/>
+            </w:tcMar>
+          </w:tcPr>
+          <w:p>
+            <w:pPr>
+              <w:widowControl w:val="0"/>
+              <w:spacing w:line="240" w:lineRule="auto"/>
+              <w:ind w:right="90"/>
+              <w:rPr>
+                <w:rFonts w:ascii="Calibri" w:eastAsia="Calibri" w:hAnsi="Calibri" w:cs="Calibri"/>
+                <w:sz w:val="28"/>
+                <w:szCs w:val="28"/>
+              </w:rPr>
+            </w:pPr>
+            <w:r>
+              <w:rPr>
+                <w:rFonts w:ascii="Calibri" w:eastAsia="Calibri" w:hAnsi="Calibri" w:cs="Calibri"/>
+                <w:sz w:val="28"/>
+                <w:szCs w:val="28"/>
+              </w:rPr>
+              <w:t>6</w:t>
+            </w:r>
+          </w:p>
+        </w:tc>
+      </w:tr>
+      <w:tr>
+        <w:tc>
+          <w:tcPr>
+            <w:tcW w:w="5445" w:type="dxa"/>
+            <w:tcBorders>
+              <w:top w:val="single" w:sz="4" w:space="0" w:color="000000"/>
+              <w:left w:val="single" w:sz="4" w:space="0" w:color="000000"/>
+              <w:bottom w:val="single" w:sz="4" w:space="0" w:color="000000"/>
+              <w:right w:val="single" w:sz="4" w:space="0" w:color="000000"/>
+            </w:tcBorders>
+            <w:tcMar>
+              <w:top w:w="100" w:type="dxa"/>
+              <w:left w:w="100" w:type="dxa"/>
+              <w:bottom w:w="100" w:type="dxa"/>
+              <w:right w:w="100" w:type="dxa"/>
+            </w:tcMar>
+          </w:tcPr>
+          <w:p>
+            <w:pPr>
+              <w:widowControl w:val="0"/>
+              <w:spacing w:line="240" w:lineRule="auto"/>
+              <w:ind w:right="90"/>
+              <w:rPr>
+                <w:rFonts w:ascii="Calibri" w:eastAsia="Calibri" w:hAnsi="Calibri" w:cs="Calibri"/>
+                <w:sz w:val="28"/>
+                <w:szCs w:val="28"/>
+              </w:rPr>
+            </w:pPr>
+            <w:r>
+              <w:rPr>
+                <w:rFonts w:ascii="Calibri" w:eastAsia="Calibri" w:hAnsi="Calibri" w:cs="Calibri"/>
+                <w:sz w:val="28"/>
+                <w:szCs w:val="28"/>
+              </w:rPr>
+              <w:t>Delete user feature</w:t>
+            </w:r>
+          </w:p>
+        </w:tc>
+        <w:tc>
+          <w:tcPr>
+            <w:tcW w:w="5445" w:type="dxa"/>
+            <w:tcBorders>
+              <w:top w:val="single" w:sz="4" w:space="0" w:color="000000"/>
+              <w:left w:val="single" w:sz="4" w:space="0" w:color="000000"/>
+              <w:bottom w:val="single" w:sz="4" w:space="0" w:color="000000"/>
+              <w:right w:val="single" w:sz="4" w:space="0" w:color="000000"/>
+            </w:tcBorders>
+            <w:tcMar>
+              <w:top w:w="100" w:type="dxa"/>
+              <w:left w:w="100" w:type="dxa"/>
+              <w:bottom w:w="100" w:type="dxa"/>
+              <w:right w:w="100" w:type="dxa"/>
+            </w:tcMar>
+          </w:tcPr>
+          <w:p>
+            <w:pPr>
+              <w:widowControl w:val="0"/>
+              <w:spacing w:line="240" w:lineRule="auto"/>
+              <w:ind w:right="90"/>
+              <w:rPr>
+                <w:rFonts w:ascii="Calibri" w:eastAsia="Calibri" w:hAnsi="Calibri" w:cs="Calibri"/>
+                <w:sz w:val="28"/>
+                <w:szCs w:val="28"/>
+              </w:rPr>
+            </w:pPr>
+            <w:r>
+              <w:rPr>
+                <w:rFonts w:ascii="Calibri" w:eastAsia="Calibri" w:hAnsi="Calibri" w:cs="Calibri"/>
+                <w:sz w:val="28"/>
+                <w:szCs w:val="28"/>
+              </w:rPr>
+              <w:t>4</w:t>
+            </w:r>
+          </w:p>
+        </w:tc>
+      </w:tr>
+      <w:tr>
+        <w:tc>
+          <w:tcPr>
+            <w:tcW w:w="5445" w:type="dxa"/>
+            <w:tcBorders>
+              <w:top w:val="single" w:sz="4" w:space="0" w:color="000000"/>
+              <w:left w:val="single" w:sz="4" w:space="0" w:color="000000"/>
+              <w:bottom w:val="single" w:sz="4" w:space="0" w:color="000000"/>
+              <w:right w:val="single" w:sz="4" w:space="0" w:color="000000"/>
+            </w:tcBorders>
+            <w:tcMar>
+              <w:top w:w="100" w:type="dxa"/>
+              <w:left w:w="100" w:type="dxa"/>
+              <w:bottom w:w="100" w:type="dxa"/>
+              <w:right w:w="100" w:type="dxa"/>
+            </w:tcMar>
+          </w:tcPr>
+          <w:p>
+            <w:pPr>
+              <w:widowControl w:val="0"/>
+              <w:spacing w:line="240" w:lineRule="auto"/>
+              <w:ind w:right="90"/>
+              <w:rPr>
+                <w:rFonts w:ascii="Calibri" w:eastAsia="Calibri" w:hAnsi="Calibri" w:cs="Calibri"/>
+                <w:sz w:val="28"/>
+                <w:szCs w:val="28"/>
+              </w:rPr>
+            </w:pPr>
+            <w:r>
+              <w:rPr>
+                <w:rFonts w:ascii="Calibri" w:eastAsia="Calibri" w:hAnsi="Calibri" w:cs="Calibri"/>
+                <w:sz w:val="28"/>
+                <w:szCs w:val="28"/>
+              </w:rPr>
+              <w:t>Database operations</w:t>
+            </w:r>
+          </w:p>
+        </w:tc>
+        <w:tc>
+          <w:tcPr>
+            <w:tcW w:w="5445" w:type="dxa"/>
+            <w:tcBorders>
+              <w:top w:val="single" w:sz="4" w:space="0" w:color="000000"/>
+              <w:left w:val="single" w:sz="4" w:space="0" w:color="000000"/>
+              <w:bottom w:val="single" w:sz="4" w:space="0" w:color="000000"/>
+              <w:right w:val="single" w:sz="4" w:space="0" w:color="000000"/>
+            </w:tcBorders>
+            <w:tcMar>
+              <w:top w:w="100" w:type="dxa"/>
+              <w:left w:w="100" w:type="dxa"/>
+              <w:bottom w:w="100" w:type="dxa"/>
+              <w:right w:w="100" w:type="dxa"/>
+            </w:tcMar>
+          </w:tcPr>
+          <w:p>
+            <w:pPr>
+              <w:widowControl w:val="0"/>
+              <w:spacing w:line="240" w:lineRule="auto"/>
+              <w:ind w:right="90"/>
+              <w:rPr>
+                <w:rFonts w:ascii="Calibri" w:eastAsia="Calibri" w:hAnsi="Calibri" w:cs="Calibri"/>
+                <w:sz w:val="28"/>
+                <w:szCs w:val="28"/>
+              </w:rPr>
+            </w:pPr>
+            <w:r>
+              <w:rPr>
+                <w:rFonts w:ascii="Calibri" w:eastAsia="Calibri" w:hAnsi="Calibri" w:cs="Calibri"/>
+                <w:sz w:val="28"/>
+                <w:szCs w:val="28"/>
+              </w:rPr>
+              <w:t>4</w:t>
+            </w:r>
+          </w:p>
+        </w:tc>
+      </w:tr>
+      <w:tr>
+        <w:tc>
+          <w:tcPr>
+            <w:tcW w:w="5445" w:type="dxa"/>
+            <w:tcBorders>
+              <w:top w:val="single" w:sz="4" w:space="0" w:color="000000"/>
+              <w:left w:val="single" w:sz="4" w:space="0" w:color="000000"/>
+              <w:bottom w:val="single" w:sz="4" w:space="0" w:color="000000"/>
+              <w:right w:val="single" w:sz="4" w:space="0" w:color="000000"/>
+            </w:tcBorders>
+            <w:tcMar>
+              <w:top w:w="100" w:type="dxa"/>
+              <w:left w:w="100" w:type="dxa"/>
+              <w:bottom w:w="100" w:type="dxa"/>
+              <w:right w:w="100" w:type="dxa"/>
+            </w:tcMar>
+          </w:tcPr>
+          <w:p>
+            <w:pPr>
+              <w:widowControl w:val="0"/>
+              <w:spacing w:line="240" w:lineRule="auto"/>
+              <w:ind w:right="90"/>
+              <w:rPr>
+                <w:rFonts w:ascii="Calibri" w:eastAsia="Calibri" w:hAnsi="Calibri" w:cs="Calibri"/>
+                <w:sz w:val="28"/>
+                <w:szCs w:val="28"/>
+              </w:rPr>
+            </w:pPr>
+            <w:r>
+              <w:rPr>
+                <w:rFonts w:ascii="Calibri" w:eastAsia="Calibri" w:hAnsi="Calibri" w:cs="Calibri"/>
+                <w:b/>
+                <w:bCs/>
+                <w:sz w:val="28"/>
+                <w:szCs w:val="28"/>
+              </w:rPr>
+              <w:t>Total</w:t>
+            </w:r>
+          </w:p>
+        </w:tc>
+        <w:tc>
+          <w:tcPr>
+            <w:tcW w:w="5445" w:type="dxa"/>
+            <w:tcBorders>
+              <w:top w:val="single" w:sz="4" w:space="0" w:color="000000"/>
+              <w:left w:val="single" w:sz="4" w:space="0" w:color="000000"/>
+              <w:bottom w:val="single" w:sz="4" w:space="0" w:color="000000"/>
+              <w:right w:val="single" w:sz="4" w:space="0" w:color="000000"/>
+            </w:tcBorders>
+            <w:tcMar>
+              <w:top w:w="100" w:type="dxa"/>
+              <w:left w:w="100" w:type="dxa"/>
+              <w:bottom w:w="100" w:type="dxa"/>
+              <w:right w:w="100" w:type="dxa"/>
+            </w:tcMar>
+          </w:tcPr>
+          <w:p>
+            <w:pPr>
+              <w:widowControl w:val="0"/>
+              <w:spacing w:line="240" w:lineRule="auto"/>
+              <w:ind w:right="90"/>
+              <w:rPr>
+                <w:rFonts w:ascii="Calibri" w:eastAsia="Calibri" w:hAnsi="Calibri" w:cs="Calibri"/>
+                <w:sz w:val="28"/>
+                <w:szCs w:val="28"/>
+              </w:rPr>
+            </w:pPr>
+            <w:r>
+              <w:rPr>
+                <w:rFonts w:ascii="Calibri" w:eastAsia="Calibri" w:hAnsi="Calibri" w:cs="Calibri"/>
+                <w:b/>
+                <w:bCs/>
+                <w:sz w:val="28"/>
+                <w:szCs w:val="28"/>
+              </w:rPr>
+              <w:t>14</w:t>
+            </w:r>
+            <w:r>
+              <w:rPr>
+                <w:rFonts w:ascii="Calibri" w:eastAsia="Calibri" w:hAnsi="Calibri" w:cs="Calibri"/>
+                <w:b/>
+                <w:bCs/>
+                <w:sz w:val="28"/>
+                <w:szCs w:val="28"/>
+              </w:rPr>
+              <w:t xml:space="preserve"> </w:t>
+            </w:r>
+            <w:proofErr w:type="spellStart"/>
+            <w:r>
+              <w:rPr>
+                <w:rFonts w:ascii="Calibri" w:eastAsia="Calibri" w:hAnsi="Calibri" w:cs="Calibri"/>
+                <w:b/>
+                <w:bCs/>
+                <w:sz w:val="28"/>
+                <w:szCs w:val="28"/>
+              </w:rPr>
+              <w:t>hrs</w:t>
+            </w:r>
+            <w:proofErr w:type="spellEnd"/>
+          </w:p>
+        </w:tc>
+      </w:tr>
+    </w:tbl>
+    <w:p>
+      <w:pPr>
+        <w:spacing w:before="240" w:after="240"/>
+        <w:ind w:right="90"/>
+        <w:jc w:val="both"/>
+        <w:rPr>
+          <w:rFonts w:ascii="Calibri" w:eastAsia="Calibri" w:hAnsi="Calibri" w:cs="Calibri"/>
+          <w:b/>
+          <w:bCs/>
+          <w:color w:val="000000"/>
+          <w:sz w:val="28"/>
+          <w:szCs w:val="28"/>
+        </w:rPr>
+      </w:pPr>
+    </w:p>
+    <w:p>
+      <w:pPr>
+        <w:spacing w:before="240" w:after="240"/>
+        <w:ind w:right="90"/>
+        <w:jc w:val="both"/>
+        <w:rPr>
+          <w:rFonts w:ascii="Calibri" w:eastAsia="Calibri" w:hAnsi="Calibri" w:cs="Calibri"/>
+          <w:b/>
+          <w:bCs/>
+          <w:color w:val="000000"/>
+          <w:sz w:val="28"/>
+          <w:szCs w:val="28"/>
+        </w:rPr>
+      </w:pPr>
+    </w:p>
+    <w:p>
+      <w:pPr>
+        <w:spacing w:before="240" w:after="240"/>
+        <w:ind w:right="90"/>
+        <w:jc w:val="both"/>
+        <w:rPr>
+          <w:rFonts w:ascii="Calibri" w:eastAsia="Calibri" w:hAnsi="Calibri" w:cs="Calibri"/>
+          <w:b/>
+          <w:bCs/>
+          <w:color w:val="000000"/>
+          <w:sz w:val="28"/>
+          <w:szCs w:val="28"/>
+        </w:rPr>
+      </w:pPr>
+    </w:p>
+    <w:p>
+      <w:pPr>
+        <w:spacing w:before="240" w:after="240"/>
+        <w:ind w:right="90"/>
+        <w:jc w:val="both"/>
+        <w:rPr>
+          <w:rFonts w:ascii="Calibri" w:eastAsia="Calibri" w:hAnsi="Calibri" w:cs="Calibri"/>
+          <w:b/>
+          <w:bCs/>
+          <w:color w:val="000000"/>
+          <w:sz w:val="28"/>
+          <w:szCs w:val="28"/>
+        </w:rPr>
+      </w:pPr>
+    </w:p>
+    <w:p>
+      <w:pPr>
+        <w:spacing w:before="240" w:after="240"/>
+        <w:ind w:right="90"/>
+        <w:jc w:val="both"/>
+        <w:rPr>
+          <w:rFonts w:ascii="Calibri" w:eastAsia="Calibri" w:hAnsi="Calibri" w:cs="Calibri"/>
+          <w:b/>
+          <w:bCs/>
+          <w:color w:val="000000"/>
+          <w:sz w:val="28"/>
+          <w:szCs w:val="28"/>
+        </w:rPr>
+      </w:pPr>
+      <w:r>
+        <w:rPr>
+          <w:rFonts w:ascii="Calibri" w:eastAsia="Calibri" w:hAnsi="Calibri" w:cs="Calibri"/>
+          <w:b/>
+          <w:bCs/>
+          <w:color w:val="000000"/>
+          <w:sz w:val="28"/>
+          <w:szCs w:val="28"/>
+        </w:rPr>
+        <w:lastRenderedPageBreak/>
+        <w:t>9. Responsive Design</w:t>
+      </w:r>
+    </w:p>
+    <w:tbl>
+      <w:tblPr>
+        <w:tblW w:w="10890" w:type="dxa"/>
+        <w:tblInd w:w="-105" w:type="dxa"/>
+        <w:tblBorders>
+          <w:top w:val="single" w:sz="4" w:space="0" w:color="000000"/>
+          <w:left w:val="single" w:sz="4" w:space="0" w:color="000000"/>
+          <w:bottom w:val="single" w:sz="4" w:space="0" w:color="000000"/>
+          <w:right w:val="single" w:sz="4" w:space="0" w:color="000000"/>
+          <w:insideH w:val="single" w:sz="4" w:space="0" w:color="000000"/>
+          <w:insideV w:val="single" w:sz="4" w:space="0" w:color="000000"/>
+        </w:tblBorders>
+        <w:tblLayout w:type="fixed"/>
+        <w:tblLook w:val="0600" w:firstRow="0" w:lastRow="0" w:firstColumn="0" w:lastColumn="0" w:noHBand="1" w:noVBand="1"/>
+      </w:tblPr>
+      <w:tblGrid>
+        <w:gridCol w:w="5445"/>
+        <w:gridCol w:w="5445"/>
+      </w:tblGrid>
+      <w:tr>
+        <w:tc>
+          <w:tcPr>
+            <w:tcW w:w="5445" w:type="dxa"/>
+            <w:tcBorders>
+              <w:top w:val="single" w:sz="4" w:space="0" w:color="000000"/>
+              <w:left w:val="single" w:sz="4" w:space="0" w:color="000000"/>
+              <w:bottom w:val="single" w:sz="4" w:space="0" w:color="000000"/>
+              <w:right w:val="single" w:sz="4" w:space="0" w:color="000000"/>
+            </w:tcBorders>
+            <w:tcMar>
+              <w:top w:w="100" w:type="dxa"/>
+              <w:left w:w="100" w:type="dxa"/>
+              <w:bottom w:w="100" w:type="dxa"/>
+              <w:right w:w="100" w:type="dxa"/>
+            </w:tcMar>
+          </w:tcPr>
+          <w:p>
+            <w:pPr>
+              <w:widowControl w:val="0"/>
+              <w:spacing w:line="240" w:lineRule="auto"/>
+              <w:ind w:right="90"/>
+              <w:jc w:val="center"/>
+              <w:rPr>
+                <w:rFonts w:ascii="Calibri" w:eastAsia="Calibri" w:hAnsi="Calibri" w:cs="Calibri"/>
+                <w:sz w:val="28"/>
+                <w:szCs w:val="28"/>
+              </w:rPr>
+            </w:pPr>
+            <w:r>
+              <w:rPr>
+                <w:rFonts w:ascii="Calibri" w:eastAsia="Calibri" w:hAnsi="Calibri" w:cs="Calibri"/>
+                <w:b/>
+                <w:bCs/>
+                <w:sz w:val="28"/>
+                <w:szCs w:val="28"/>
+              </w:rPr>
+              <w:t>Task</w:t>
+            </w:r>
+          </w:p>
+        </w:tc>
+        <w:tc>
+          <w:tcPr>
+            <w:tcW w:w="5445" w:type="dxa"/>
+            <w:tcBorders>
+              <w:top w:val="single" w:sz="4" w:space="0" w:color="000000"/>
+              <w:left w:val="single" w:sz="4" w:space="0" w:color="000000"/>
+              <w:bottom w:val="single" w:sz="4" w:space="0" w:color="000000"/>
+              <w:right w:val="single" w:sz="4" w:space="0" w:color="000000"/>
+            </w:tcBorders>
+            <w:tcMar>
+              <w:top w:w="100" w:type="dxa"/>
+              <w:left w:w="100" w:type="dxa"/>
+              <w:bottom w:w="100" w:type="dxa"/>
+              <w:right w:w="100" w:type="dxa"/>
+            </w:tcMar>
+          </w:tcPr>
+          <w:p>
+            <w:pPr>
+              <w:widowControl w:val="0"/>
+              <w:spacing w:line="240" w:lineRule="auto"/>
+              <w:ind w:right="90"/>
+              <w:jc w:val="center"/>
+              <w:rPr>
+                <w:rFonts w:ascii="Calibri" w:eastAsia="Calibri" w:hAnsi="Calibri" w:cs="Calibri"/>
+                <w:sz w:val="28"/>
+                <w:szCs w:val="28"/>
+              </w:rPr>
+            </w:pPr>
+            <w:r>
+              <w:rPr>
+                <w:rFonts w:ascii="Calibri" w:eastAsia="Calibri" w:hAnsi="Calibri" w:cs="Calibri"/>
+                <w:b/>
+                <w:bCs/>
+                <w:sz w:val="28"/>
+                <w:szCs w:val="28"/>
+              </w:rPr>
+              <w:t>Estimated Time (</w:t>
+            </w:r>
+            <w:proofErr w:type="spellStart"/>
+            <w:r>
+              <w:rPr>
+                <w:rFonts w:ascii="Calibri" w:eastAsia="Calibri" w:hAnsi="Calibri" w:cs="Calibri"/>
+                <w:b/>
+                <w:bCs/>
+                <w:sz w:val="28"/>
+                <w:szCs w:val="28"/>
+              </w:rPr>
+              <w:t>hrs</w:t>
+            </w:r>
+            <w:proofErr w:type="spellEnd"/>
+            <w:r>
+              <w:rPr>
+                <w:rFonts w:ascii="Calibri" w:eastAsia="Calibri" w:hAnsi="Calibri" w:cs="Calibri"/>
+                <w:b/>
+                <w:bCs/>
+                <w:sz w:val="28"/>
+                <w:szCs w:val="28"/>
+              </w:rPr>
+              <w:t>)</w:t>
+            </w:r>
+          </w:p>
+        </w:tc>
+      </w:tr>
+      <w:tr>
+        <w:tc>
+          <w:tcPr>
+            <w:tcW w:w="5445" w:type="dxa"/>
+            <w:tcBorders>
+              <w:top w:val="single" w:sz="4" w:space="0" w:color="000000"/>
+              <w:left w:val="single" w:sz="4" w:space="0" w:color="000000"/>
+              <w:bottom w:val="single" w:sz="4" w:space="0" w:color="000000"/>
+              <w:right w:val="single" w:sz="4" w:space="0" w:color="000000"/>
+            </w:tcBorders>
+            <w:tcMar>
+              <w:top w:w="100" w:type="dxa"/>
+              <w:left w:w="100" w:type="dxa"/>
+              <w:bottom w:w="100" w:type="dxa"/>
+              <w:right w:w="100" w:type="dxa"/>
+            </w:tcMar>
+          </w:tcPr>
+          <w:p>
+            <w:pPr>
+              <w:widowControl w:val="0"/>
+              <w:spacing w:line="240" w:lineRule="auto"/>
+              <w:ind w:right="90"/>
+              <w:rPr>
+                <w:rFonts w:ascii="Calibri" w:eastAsia="Calibri" w:hAnsi="Calibri" w:cs="Calibri"/>
+                <w:sz w:val="28"/>
+                <w:szCs w:val="28"/>
+              </w:rPr>
+            </w:pPr>
+            <w:r>
+              <w:rPr>
+                <w:rFonts w:ascii="Calibri" w:eastAsia="Calibri" w:hAnsi="Calibri" w:cs="Calibri"/>
+                <w:sz w:val="28"/>
+                <w:szCs w:val="28"/>
+              </w:rPr>
+              <w:t>Mobile layout implementation</w:t>
+            </w:r>
+          </w:p>
+        </w:tc>
+        <w:tc>
+          <w:tcPr>
+            <w:tcW w:w="5445" w:type="dxa"/>
+            <w:tcBorders>
+              <w:top w:val="single" w:sz="4" w:space="0" w:color="000000"/>
+              <w:left w:val="single" w:sz="4" w:space="0" w:color="000000"/>
+              <w:bottom w:val="single" w:sz="4" w:space="0" w:color="000000"/>
+              <w:right w:val="single" w:sz="4" w:space="0" w:color="000000"/>
+            </w:tcBorders>
+            <w:tcMar>
+              <w:top w:w="100" w:type="dxa"/>
+              <w:left w:w="100" w:type="dxa"/>
+              <w:bottom w:w="100" w:type="dxa"/>
+              <w:right w:w="100" w:type="dxa"/>
+            </w:tcMar>
+          </w:tcPr>
+          <w:p>
+            <w:pPr>
+              <w:widowControl w:val="0"/>
+              <w:spacing w:line="240" w:lineRule="auto"/>
+              <w:ind w:right="90"/>
+              <w:rPr>
+                <w:rFonts w:ascii="Calibri" w:eastAsia="Calibri" w:hAnsi="Calibri" w:cs="Calibri"/>
+                <w:sz w:val="28"/>
+                <w:szCs w:val="28"/>
+              </w:rPr>
+            </w:pPr>
+            <w:r>
+              <w:rPr>
+                <w:rFonts w:ascii="Calibri" w:eastAsia="Calibri" w:hAnsi="Calibri" w:cs="Calibri"/>
+                <w:sz w:val="28"/>
+                <w:szCs w:val="28"/>
+              </w:rPr>
+              <w:t>6</w:t>
+            </w:r>
+          </w:p>
+        </w:tc>
+      </w:tr>
+      <w:tr>
+        <w:tc>
+          <w:tcPr>
+            <w:tcW w:w="5445" w:type="dxa"/>
+            <w:tcBorders>
+              <w:top w:val="single" w:sz="4" w:space="0" w:color="000000"/>
+              <w:left w:val="single" w:sz="4" w:space="0" w:color="000000"/>
+              <w:bottom w:val="single" w:sz="4" w:space="0" w:color="000000"/>
+              <w:right w:val="single" w:sz="4" w:space="0" w:color="000000"/>
+            </w:tcBorders>
+            <w:tcMar>
+              <w:top w:w="100" w:type="dxa"/>
+              <w:left w:w="100" w:type="dxa"/>
+              <w:bottom w:w="100" w:type="dxa"/>
+              <w:right w:w="100" w:type="dxa"/>
+            </w:tcMar>
+          </w:tcPr>
+          <w:p>
+            <w:pPr>
+              <w:widowControl w:val="0"/>
+              <w:spacing w:line="240" w:lineRule="auto"/>
+              <w:ind w:right="90"/>
+              <w:rPr>
+                <w:rFonts w:ascii="Calibri" w:eastAsia="Calibri" w:hAnsi="Calibri" w:cs="Calibri"/>
+                <w:sz w:val="28"/>
+                <w:szCs w:val="28"/>
+              </w:rPr>
+            </w:pPr>
+            <w:r>
+              <w:rPr>
+                <w:rFonts w:ascii="Calibri" w:eastAsia="Calibri" w:hAnsi="Calibri" w:cs="Calibri"/>
+                <w:sz w:val="28"/>
+                <w:szCs w:val="28"/>
+              </w:rPr>
+              <w:t>Tablet layout implementation</w:t>
+            </w:r>
+          </w:p>
+        </w:tc>
+        <w:tc>
+          <w:tcPr>
+            <w:tcW w:w="5445" w:type="dxa"/>
+            <w:tcBorders>
+              <w:top w:val="single" w:sz="4" w:space="0" w:color="000000"/>
+              <w:left w:val="single" w:sz="4" w:space="0" w:color="000000"/>
+              <w:bottom w:val="single" w:sz="4" w:space="0" w:color="000000"/>
+              <w:right w:val="single" w:sz="4" w:space="0" w:color="000000"/>
+            </w:tcBorders>
+            <w:tcMar>
+              <w:top w:w="100" w:type="dxa"/>
+              <w:left w:w="100" w:type="dxa"/>
+              <w:bottom w:w="100" w:type="dxa"/>
+              <w:right w:w="100" w:type="dxa"/>
+            </w:tcMar>
+          </w:tcPr>
+          <w:p>
+            <w:pPr>
+              <w:widowControl w:val="0"/>
+              <w:spacing w:line="240" w:lineRule="auto"/>
+              <w:ind w:right="90"/>
+              <w:rPr>
+                <w:rFonts w:ascii="Calibri" w:eastAsia="Calibri" w:hAnsi="Calibri" w:cs="Calibri"/>
+                <w:sz w:val="28"/>
+                <w:szCs w:val="28"/>
+              </w:rPr>
+            </w:pPr>
+            <w:r>
+              <w:rPr>
+                <w:rFonts w:ascii="Calibri" w:eastAsia="Calibri" w:hAnsi="Calibri" w:cs="Calibri"/>
+                <w:sz w:val="28"/>
+                <w:szCs w:val="28"/>
+              </w:rPr>
+              <w:t>4</w:t>
+            </w:r>
+          </w:p>
+        </w:tc>
+      </w:tr>
+      <w:tr>
+        <w:tc>
+          <w:tcPr>
+            <w:tcW w:w="5445" w:type="dxa"/>
+            <w:tcBorders>
+              <w:top w:val="single" w:sz="4" w:space="0" w:color="000000"/>
+              <w:left w:val="single" w:sz="4" w:space="0" w:color="000000"/>
+              <w:bottom w:val="single" w:sz="4" w:space="0" w:color="000000"/>
+              <w:right w:val="single" w:sz="4" w:space="0" w:color="000000"/>
+            </w:tcBorders>
+            <w:tcMar>
+              <w:top w:w="100" w:type="dxa"/>
+              <w:left w:w="100" w:type="dxa"/>
+              <w:bottom w:w="100" w:type="dxa"/>
+              <w:right w:w="100" w:type="dxa"/>
+            </w:tcMar>
+          </w:tcPr>
+          <w:p>
+            <w:pPr>
+              <w:widowControl w:val="0"/>
+              <w:spacing w:line="240" w:lineRule="auto"/>
+              <w:ind w:right="90"/>
+              <w:rPr>
+                <w:rFonts w:ascii="Calibri" w:eastAsia="Calibri" w:hAnsi="Calibri" w:cs="Calibri"/>
+                <w:sz w:val="28"/>
+                <w:szCs w:val="28"/>
+              </w:rPr>
+            </w:pPr>
+            <w:r>
+              <w:rPr>
+                <w:rFonts w:ascii="Calibri" w:eastAsia="Calibri" w:hAnsi="Calibri" w:cs="Calibri"/>
+                <w:sz w:val="28"/>
+                <w:szCs w:val="28"/>
+              </w:rPr>
+              <w:t>Responsive testing &amp; fixes</w:t>
+            </w:r>
+          </w:p>
+        </w:tc>
+        <w:tc>
+          <w:tcPr>
+            <w:tcW w:w="5445" w:type="dxa"/>
+            <w:tcBorders>
+              <w:top w:val="single" w:sz="4" w:space="0" w:color="000000"/>
+              <w:left w:val="single" w:sz="4" w:space="0" w:color="000000"/>
+              <w:bottom w:val="single" w:sz="4" w:space="0" w:color="000000"/>
+              <w:right w:val="single" w:sz="4" w:space="0" w:color="000000"/>
+            </w:tcBorders>
+            <w:tcMar>
+              <w:top w:w="100" w:type="dxa"/>
+              <w:left w:w="100" w:type="dxa"/>
+              <w:bottom w:w="100" w:type="dxa"/>
+              <w:right w:w="100" w:type="dxa"/>
+            </w:tcMar>
+          </w:tcPr>
+          <w:p>
+            <w:pPr>
+              <w:widowControl w:val="0"/>
+              <w:spacing w:line="240" w:lineRule="auto"/>
+              <w:ind w:right="90"/>
+              <w:rPr>
+                <w:rFonts w:ascii="Calibri" w:eastAsia="Calibri" w:hAnsi="Calibri" w:cs="Calibri"/>
+                <w:sz w:val="28"/>
+                <w:szCs w:val="28"/>
+              </w:rPr>
+            </w:pPr>
+            <w:r>
+              <w:rPr>
+                <w:rFonts w:ascii="Calibri" w:eastAsia="Calibri" w:hAnsi="Calibri" w:cs="Calibri"/>
+                <w:sz w:val="28"/>
+                <w:szCs w:val="28"/>
+              </w:rPr>
+              <w:t>4</w:t>
+            </w:r>
+          </w:p>
+        </w:tc>
+      </w:tr>
+      <w:tr>
+        <w:tc>
+          <w:tcPr>
+            <w:tcW w:w="5445" w:type="dxa"/>
+            <w:tcBorders>
+              <w:top w:val="single" w:sz="4" w:space="0" w:color="000000"/>
+              <w:left w:val="single" w:sz="4" w:space="0" w:color="000000"/>
+              <w:bottom w:val="single" w:sz="4" w:space="0" w:color="000000"/>
+              <w:right w:val="single" w:sz="4" w:space="0" w:color="000000"/>
+            </w:tcBorders>
+            <w:tcMar>
+              <w:top w:w="100" w:type="dxa"/>
+              <w:left w:w="100" w:type="dxa"/>
+              <w:bottom w:w="100" w:type="dxa"/>
+              <w:right w:w="100" w:type="dxa"/>
+            </w:tcMar>
+          </w:tcPr>
+          <w:p>
+            <w:pPr>
+              <w:widowControl w:val="0"/>
+              <w:spacing w:line="240" w:lineRule="auto"/>
+              <w:ind w:right="90"/>
+              <w:rPr>
+                <w:rFonts w:ascii="Calibri" w:eastAsia="Calibri" w:hAnsi="Calibri" w:cs="Calibri"/>
+                <w:sz w:val="28"/>
+                <w:szCs w:val="28"/>
+              </w:rPr>
+            </w:pPr>
+            <w:r>
+              <w:rPr>
+                <w:rFonts w:ascii="Calibri" w:eastAsia="Calibri" w:hAnsi="Calibri" w:cs="Calibri"/>
+                <w:b/>
+                <w:bCs/>
+                <w:sz w:val="28"/>
+                <w:szCs w:val="28"/>
+              </w:rPr>
+              <w:t>Total</w:t>
+            </w:r>
+          </w:p>
+        </w:tc>
+        <w:tc>
+          <w:tcPr>
+            <w:tcW w:w="5445" w:type="dxa"/>
+            <w:tcBorders>
+              <w:top w:val="single" w:sz="4" w:space="0" w:color="000000"/>
+              <w:left w:val="single" w:sz="4" w:space="0" w:color="000000"/>
+              <w:bottom w:val="single" w:sz="4" w:space="0" w:color="000000"/>
+              <w:right w:val="single" w:sz="4" w:space="0" w:color="000000"/>
+            </w:tcBorders>
+            <w:tcMar>
+              <w:top w:w="100" w:type="dxa"/>
+              <w:left w:w="100" w:type="dxa"/>
+              <w:bottom w:w="100" w:type="dxa"/>
+              <w:right w:w="100" w:type="dxa"/>
+            </w:tcMar>
+          </w:tcPr>
+          <w:p>
+            <w:pPr>
+              <w:widowControl w:val="0"/>
+              <w:spacing w:line="240" w:lineRule="auto"/>
+              <w:ind w:right="90"/>
+              <w:rPr>
+                <w:rFonts w:ascii="Calibri" w:eastAsia="Calibri" w:hAnsi="Calibri" w:cs="Calibri"/>
+                <w:sz w:val="28"/>
+                <w:szCs w:val="28"/>
+              </w:rPr>
+            </w:pPr>
+            <w:r>
+              <w:rPr>
+                <w:rFonts w:ascii="Calibri" w:eastAsia="Calibri" w:hAnsi="Calibri" w:cs="Calibri"/>
+                <w:b/>
+                <w:bCs/>
+                <w:sz w:val="28"/>
+                <w:szCs w:val="28"/>
+              </w:rPr>
+              <w:t xml:space="preserve">14 </w:t>
+            </w:r>
+            <w:proofErr w:type="spellStart"/>
+            <w:r>
+              <w:rPr>
+                <w:rFonts w:ascii="Calibri" w:eastAsia="Calibri" w:hAnsi="Calibri" w:cs="Calibri"/>
+                <w:b/>
+                <w:bCs/>
+                <w:sz w:val="28"/>
+                <w:szCs w:val="28"/>
+              </w:rPr>
+              <w:t>hrs</w:t>
+            </w:r>
+            <w:proofErr w:type="spellEnd"/>
+          </w:p>
+        </w:tc>
+      </w:tr>
+    </w:tbl>
+    <w:p>
+      <w:pPr>
         <w:pStyle w:val="Heading2"/>
         <w:keepNext w:val="0"/>
         <w:keepLines w:val="0"/>
@@ -6902,12 +7670,6 @@
           <w:szCs w:val="28"/>
         </w:rPr>
       </w:pPr>
-      <w:bookmarkStart w:id="21" w:name="_uxpvxeiyh60j" w:colFirst="0" w:colLast="0"/>
-      <w:bookmarkStart w:id="22" w:name="_qtuc9ys6xhga" w:colFirst="0" w:colLast="0"/>
-      <w:bookmarkStart w:id="23" w:name="_ci4qfwyn0856" w:colFirst="0" w:colLast="0"/>
-      <w:bookmarkEnd w:id="21"/>
-      <w:bookmarkEnd w:id="22"/>
-      <w:bookmarkEnd w:id="23"/>
       <w:r>
         <w:rPr>
           <w:rFonts w:ascii="Calibri" w:eastAsia="Calibri" w:hAnsi="Calibri" w:cs="Calibri"/>
@@ -7098,7 +7860,15 @@
                 <w:sz w:val="28"/>
                 <w:szCs w:val="28"/>
               </w:rPr>
-              <w:t xml:space="preserve"> 128 hours</w:t>
+              <w:t xml:space="preserve"> 156</w:t>
+            </w:r>
+            <w:r>
+              <w:rPr>
+                <w:rFonts w:ascii="Calibri" w:eastAsia="Calibri" w:hAnsi="Calibri" w:cs="Calibri"/>
+                <w:sz w:val="28"/>
+                <w:szCs w:val="28"/>
+              </w:rPr>
+              <w:t xml:space="preserve"> hours</w:t>
             </w:r>
           </w:p>
         </w:tc>
@@ -7184,7 +7954,15 @@
                 <w:sz w:val="28"/>
                 <w:szCs w:val="28"/>
               </w:rPr>
-              <w:t xml:space="preserve"> 60 hours</w:t>
+              <w:t xml:space="preserve"> 60</w:t>
+            </w:r>
+            <w:r>
+              <w:rPr>
+                <w:rFonts w:ascii="Calibri" w:eastAsia="Calibri" w:hAnsi="Calibri" w:cs="Calibri"/>
+                <w:sz w:val="28"/>
+                <w:szCs w:val="28"/>
+              </w:rPr>
+              <w:t xml:space="preserve"> hours</w:t>
             </w:r>
           </w:p>
         </w:tc>
@@ -7270,7 +8048,15 @@
                 <w:sz w:val="28"/>
                 <w:szCs w:val="28"/>
               </w:rPr>
-              <w:t xml:space="preserve"> 55 hours</w:t>
+              <w:t xml:space="preserve"> 55</w:t>
+            </w:r>
+            <w:r>
+              <w:rPr>
+                <w:rFonts w:ascii="Calibri" w:eastAsia="Calibri" w:hAnsi="Calibri" w:cs="Calibri"/>
+                <w:sz w:val="28"/>
+                <w:szCs w:val="28"/>
+              </w:rPr>
+              <w:t xml:space="preserve"> hours</w:t>
             </w:r>
           </w:p>
         </w:tc>
@@ -7356,7 +8142,15 @@
                 <w:sz w:val="28"/>
                 <w:szCs w:val="28"/>
               </w:rPr>
-              <w:t xml:space="preserve"> 243 hours</w:t>
+              <w:t xml:space="preserve"> 271</w:t>
+            </w:r>
+            <w:r>
+              <w:rPr>
+                <w:rFonts w:ascii="Calibri" w:eastAsia="Calibri" w:hAnsi="Calibri" w:cs="Calibri"/>
+                <w:sz w:val="28"/>
+                <w:szCs w:val="28"/>
+              </w:rPr>
+              <w:t xml:space="preserve"> hours</w:t>
             </w:r>
           </w:p>
         </w:tc>
@@ -7378,8 +8172,8 @@
           <w:szCs w:val="28"/>
         </w:rPr>
       </w:pPr>
-      <w:bookmarkStart w:id="24" w:name="_mz6lfs41z0o9" w:colFirst="0" w:colLast="0"/>
-      <w:bookmarkEnd w:id="24"/>
+      <w:bookmarkStart w:id="23" w:name="_mz6lfs41z0o9" w:colFirst="0" w:colLast="0"/>
+      <w:bookmarkEnd w:id="23"/>
       <w:r>
         <w:rPr>
           <w:rFonts w:ascii="Calibri" w:eastAsia="Calibri" w:hAnsi="Calibri" w:cs="Calibri"/>
@@ -7582,6 +8376,36 @@
           <w:szCs w:val="28"/>
         </w:rPr>
       </w:pPr>
+    </w:p>
+    <w:p>
+      <w:pPr>
+        <w:spacing w:before="240" w:after="240"/>
+        <w:ind w:left="720" w:right="90"/>
+        <w:jc w:val="both"/>
+        <w:rPr>
+          <w:rFonts w:ascii="Calibri" w:eastAsia="Calibri" w:hAnsi="Calibri" w:cs="Calibri"/>
+          <w:b/>
+          <w:bCs/>
+          <w:sz w:val="28"/>
+          <w:szCs w:val="28"/>
+        </w:rPr>
+      </w:pPr>
+    </w:p>
+    <w:p>
+      <w:pPr>
+        <w:spacing w:before="240" w:after="240"/>
+        <w:ind w:left="720" w:right="90"/>
+        <w:jc w:val="both"/>
+        <w:rPr>
+          <w:rFonts w:ascii="Calibri" w:eastAsia="Calibri" w:hAnsi="Calibri" w:cs="Calibri"/>
+          <w:b/>
+          <w:bCs/>
+          <w:sz w:val="28"/>
+          <w:szCs w:val="28"/>
+        </w:rPr>
+      </w:pPr>
+      <w:bookmarkStart w:id="24" w:name="_GoBack"/>
+      <w:bookmarkEnd w:id="24"/>
       <w:r>
         <w:rPr>
           <w:rFonts w:ascii="Calibri" w:eastAsia="Calibri" w:hAnsi="Calibri" w:cs="Calibri"/>
@@ -8530,71 +9354,6 @@
         </w:rPr>
         <w:t>HealthCare Plus is a project that demonstrates my understanding of web development concepts, including user stories, CRUD functionality, accessibility, and responsive design. This project allows me to apply the skills learned throughout the program in a practical and structured way.</w:t>
       </w:r>
-    </w:p>
-    <w:p>
-      <w:pPr>
-        <w:spacing w:before="240" w:after="240"/>
-        <w:ind w:right="90"/>
-        <w:jc w:val="both"/>
-        <w:rPr>
-          <w:rFonts w:ascii="Calibri" w:eastAsia="Calibri" w:hAnsi="Calibri" w:cs="Calibri"/>
-          <w:sz w:val="28"/>
-          <w:szCs w:val="28"/>
-        </w:rPr>
-      </w:pPr>
-      <w:r>
-        <w:rPr>
-          <w:rFonts w:ascii="Calibri" w:eastAsia="Calibri" w:hAnsi="Calibri" w:cs="Calibri"/>
-          <w:sz w:val="28"/>
-          <w:szCs w:val="28"/>
-        </w:rPr>
-        <w:lastRenderedPageBreak/>
-        <w:t xml:space="preserve"> </w:t>
-      </w:r>
-    </w:p>
-    <w:p>
-      <w:pPr>
-        <w:spacing w:before="240" w:after="240"/>
-        <w:ind w:right="90"/>
-        <w:jc w:val="both"/>
-        <w:rPr>
-          <w:rFonts w:ascii="Calibri" w:eastAsia="Calibri" w:hAnsi="Calibri" w:cs="Calibri"/>
-          <w:sz w:val="28"/>
-          <w:szCs w:val="28"/>
-        </w:rPr>
-      </w:pPr>
-      <w:r>
-        <w:rPr>
-          <w:rFonts w:ascii="Calibri" w:eastAsia="Calibri" w:hAnsi="Calibri" w:cs="Calibri"/>
-          <w:sz w:val="28"/>
-          <w:szCs w:val="28"/>
-        </w:rPr>
-        <w:t xml:space="preserve"> </w:t>
-      </w:r>
-    </w:p>
-    <w:p>
-      <w:pPr>
-        <w:spacing w:before="240" w:after="240"/>
-        <w:ind w:right="90"/>
-        <w:jc w:val="both"/>
-        <w:rPr>
-          <w:rFonts w:ascii="Calibri" w:eastAsia="Calibri" w:hAnsi="Calibri" w:cs="Calibri"/>
-          <w:sz w:val="28"/>
-          <w:szCs w:val="28"/>
-        </w:rPr>
-      </w:pPr>
-    </w:p>
-    <w:p>
-      <w:pPr>
-        <w:spacing w:before="240" w:after="240"/>
-        <w:ind w:right="90"/>
-        <w:jc w:val="both"/>
-        <w:rPr>
-          <w:rFonts w:ascii="Calibri" w:eastAsia="Calibri" w:hAnsi="Calibri" w:cs="Calibri"/>
-          <w:sz w:val="28"/>
-          <w:szCs w:val="28"/>
-        </w:rPr>
-      </w:pPr>
     </w:p>
     <w:sectPr>
       <w:pgSz w:w="12240" w:h="15840"/>
@@ -8835,6 +9594,92 @@
     </w:lvl>
   </w:abstractNum>
   <w:abstractNum w:abstractNumId="2">
+    <w:nsid w:val="0BCE1A36"/>
+    <w:multiLevelType w:val="hybridMultilevel"/>
+    <w:tmpl w:val="8CD09442"/>
+    <w:lvl w:ilvl="0" w:tplc="1009000F">
+      <w:start w:val="1"/>
+      <w:numFmt w:val="decimal"/>
+      <w:lvlText w:val="%1."/>
+      <w:lvlJc w:val="left"/>
+      <w:pPr>
+        <w:ind w:left="720" w:hanging="360"/>
+      </w:pPr>
+    </w:lvl>
+    <w:lvl w:ilvl="1" w:tplc="10090019">
+      <w:start w:val="1"/>
+      <w:numFmt w:val="lowerLetter"/>
+      <w:lvlText w:val="%2."/>
+      <w:lvlJc w:val="left"/>
+      <w:pPr>
+        <w:ind w:left="1440" w:hanging="360"/>
+      </w:pPr>
+    </w:lvl>
+    <w:lvl w:ilvl="2" w:tplc="1009001B" w:tentative="1">
+      <w:start w:val="1"/>
+      <w:numFmt w:val="lowerRoman"/>
+      <w:lvlText w:val="%3."/>
+      <w:lvlJc w:val="right"/>
+      <w:pPr>
+        <w:ind w:left="2160" w:hanging="180"/>
+      </w:pPr>
+    </w:lvl>
+    <w:lvl w:ilvl="3" w:tplc="1009000F" w:tentative="1">
+      <w:start w:val="1"/>
+      <w:numFmt w:val="decimal"/>
+      <w:lvlText w:val="%4."/>
+      <w:lvlJc w:val="left"/>
+      <w:pPr>
+        <w:ind w:left="2880" w:hanging="360"/>
+      </w:pPr>
+    </w:lvl>
+    <w:lvl w:ilvl="4" w:tplc="10090019" w:tentative="1">
+      <w:start w:val="1"/>
+      <w:numFmt w:val="lowerLetter"/>
+      <w:lvlText w:val="%5."/>
+      <w:lvlJc w:val="left"/>
+      <w:pPr>
+        <w:ind w:left="3600" w:hanging="360"/>
+      </w:pPr>
+    </w:lvl>
+    <w:lvl w:ilvl="5" w:tplc="1009001B" w:tentative="1">
+      <w:start w:val="1"/>
+      <w:numFmt w:val="lowerRoman"/>
+      <w:lvlText w:val="%6."/>
+      <w:lvlJc w:val="right"/>
+      <w:pPr>
+        <w:ind w:left="4320" w:hanging="180"/>
+      </w:pPr>
+    </w:lvl>
+    <w:lvl w:ilvl="6" w:tplc="1009000F" w:tentative="1">
+      <w:start w:val="1"/>
+      <w:numFmt w:val="decimal"/>
+      <w:lvlText w:val="%7."/>
+      <w:lvlJc w:val="left"/>
+      <w:pPr>
+        <w:ind w:left="5040" w:hanging="360"/>
+      </w:pPr>
+    </w:lvl>
+    <w:lvl w:ilvl="7" w:tplc="10090019" w:tentative="1">
+      <w:start w:val="1"/>
+      <w:numFmt w:val="lowerLetter"/>
+      <w:lvlText w:val="%8."/>
+      <w:lvlJc w:val="left"/>
+      <w:pPr>
+        <w:ind w:left="5760" w:hanging="360"/>
+      </w:pPr>
+    </w:lvl>
+    <w:lvl w:ilvl="8" w:tplc="1009001B" w:tentative="1">
+      <w:start w:val="1"/>
+      <w:numFmt w:val="lowerRoman"/>
+      <w:lvlText w:val="%9."/>
+      <w:lvlJc w:val="right"/>
+      <w:pPr>
+        <w:ind w:left="6480" w:hanging="180"/>
+      </w:pPr>
+    </w:lvl>
+  </w:abstractNum>
+  <w:abstractNum w:abstractNumId="3">
     <w:nsid w:val="30AD0A11"/>
     <w:multiLevelType w:val="multilevel"/>
     <w:tmpl w:val="E4C27EEE"/>
@@ -8947,7 +9792,7 @@
       </w:rPr>
     </w:lvl>
   </w:abstractNum>
-  <w:abstractNum w:abstractNumId="3">
+  <w:abstractNum w:abstractNumId="4">
     <w:nsid w:val="693D225D"/>
     <w:multiLevelType w:val="multilevel"/>
     <w:tmpl w:val="E36EA390"/>
@@ -9060,7 +9905,7 @@
       </w:rPr>
     </w:lvl>
   </w:abstractNum>
-  <w:abstractNum w:abstractNumId="4">
+  <w:abstractNum w:abstractNumId="5">
     <w:nsid w:val="7C6E5626"/>
     <w:multiLevelType w:val="multilevel"/>
     <w:tmpl w:val="73F2833E"/>
@@ -9173,7 +10018,7 @@
       </w:rPr>
     </w:lvl>
   </w:abstractNum>
-  <w:abstractNum w:abstractNumId="5">
+  <w:abstractNum w:abstractNumId="6">
     <w:nsid w:val="7E7C3773"/>
     <w:multiLevelType w:val="multilevel"/>
     <w:tmpl w:val="C7CC881A"/>
@@ -9287,13 +10132,13 @@
     </w:lvl>
   </w:abstractNum>
   <w:num w:numId="1">
-    <w:abstractNumId w:val="5"/>
+    <w:abstractNumId w:val="6"/>
   </w:num>
   <w:num w:numId="2">
-    <w:abstractNumId w:val="3"/>
+    <w:abstractNumId w:val="4"/>
   </w:num>
   <w:num w:numId="3">
-    <w:abstractNumId w:val="2"/>
+    <w:abstractNumId w:val="3"/>
   </w:num>
   <w:num w:numId="4">
     <w:abstractNumId w:val="0"/>
@@ -9302,7 +10147,10 @@
     <w:abstractNumId w:val="1"/>
   </w:num>
   <w:num w:numId="6">
-    <w:abstractNumId w:val="4"/>
+    <w:abstractNumId w:val="5"/>
+  </w:num>
+  <w:num w:numId="7">
+    <w:abstractNumId w:val="2"/>
   </w:num>
 </w:numbering>
 </file>
@@ -9328,7 +10176,7 @@
     <w:lsdException w:name="Normal" w:uiPriority="0" w:qFormat="1"/>
     <w:lsdException w:name="heading 1" w:uiPriority="9" w:qFormat="1"/>
     <w:lsdException w:name="heading 2" w:semiHidden="1" w:uiPriority="9" w:unhideWhenUsed="1" w:qFormat="1"/>
-    <w:lsdException w:name="heading 3" w:semiHidden="1" w:uiPriority="9" w:unhideWhenUsed="1" w:qFormat="1"/>
+    <w:lsdException w:name="heading 3" w:semiHidden="1" w:uiPriority="0" w:unhideWhenUsed="1" w:qFormat="1"/>
     <w:lsdException w:name="heading 4" w:semiHidden="1" w:uiPriority="9" w:unhideWhenUsed="1" w:qFormat="1"/>
     <w:lsdException w:name="heading 5" w:semiHidden="1" w:uiPriority="9" w:unhideWhenUsed="1" w:qFormat="1"/>
     <w:lsdException w:name="heading 6" w:semiHidden="1" w:uiPriority="9" w:unhideWhenUsed="1" w:qFormat="1"/>
@@ -9734,6 +10582,7 @@
     <w:name w:val="heading 3"/>
     <w:basedOn w:val="Normal"/>
     <w:next w:val="Normal"/>
+    <w:link w:val="Heading3Char"/>
     <w:pPr>
       <w:keepNext/>
       <w:keepLines/>
@@ -9962,6 +10811,28 @@
         <w:right w:w="100" w:type="dxa"/>
       </w:tblCellMar>
     </w:tblPr>
+  </w:style>
+  <w:style w:type="paragraph" w:styleId="ListParagraph">
+    <w:name w:val="List Paragraph"/>
+    <w:basedOn w:val="Normal"/>
+    <w:uiPriority w:val="34"/>
+    <w:qFormat/>
+    <w:rsid w:val="001B12B6"/>
+    <w:pPr>
+      <w:ind w:left="720"/>
+      <w:contextualSpacing/>
+    </w:pPr>
+  </w:style>
+  <w:style w:type="character" w:customStyle="1" w:styleId="Heading3Char">
+    <w:name w:val="Heading 3 Char"/>
+    <w:basedOn w:val="DefaultParagraphFont"/>
+    <w:link w:val="Heading3"/>
+    <w:rsid w:val="00512947"/>
+    <w:rPr>
+      <w:color w:val="434343"/>
+      <w:sz w:val="28"/>
+      <w:szCs w:val="28"/>
+    </w:rPr>
   </w:style>
 </w:styles>
 </file>

</xml_diff>

<commit_message>
Learn how to deploy website
</commit_message>
<xml_diff>
--- a/Week_1/HTTP 5310 – Capstone Requirements Document.docx
+++ b/Week_1/HTTP 5310 – Capstone Requirements Document.docx
@@ -845,15 +845,15 @@
           <w:sz w:val="14"/>
           <w:szCs w:val="14"/>
         </w:rPr>
-        <w:t xml:space="preserve">       </w:t>
-      </w:r>
-      <w:r>
-        <w:rPr>
-          <w:rFonts w:ascii="Calibri" w:eastAsia="Calibri" w:hAnsi="Calibri" w:cs="Calibri"/>
-          <w:sz w:val="28"/>
-          <w:szCs w:val="28"/>
-        </w:rPr>
-        <w:t xml:space="preserve"> Find a Doctor</w:t>
+        <w:t xml:space="preserve">      </w:t>
+      </w:r>
+      <w:r>
+        <w:rPr>
+          <w:rFonts w:ascii="Calibri" w:eastAsia="Calibri" w:hAnsi="Calibri" w:cs="Calibri"/>
+          <w:sz w:val="28"/>
+          <w:szCs w:val="28"/>
+        </w:rPr>
+        <w:t>Find a Doctor</w:t>
       </w:r>
     </w:p>
     <w:p>
@@ -880,15 +880,15 @@
           <w:sz w:val="14"/>
           <w:szCs w:val="14"/>
         </w:rPr>
-        <w:t xml:space="preserve">       </w:t>
-      </w:r>
-      <w:r>
-        <w:rPr>
-          <w:rFonts w:ascii="Calibri" w:eastAsia="Calibri" w:hAnsi="Calibri" w:cs="Calibri"/>
-          <w:sz w:val="28"/>
-          <w:szCs w:val="28"/>
-        </w:rPr>
-        <w:t xml:space="preserve"> Appointments</w:t>
+        <w:t xml:space="preserve">      </w:t>
+      </w:r>
+      <w:r>
+        <w:rPr>
+          <w:rFonts w:ascii="Calibri" w:eastAsia="Calibri" w:hAnsi="Calibri" w:cs="Calibri"/>
+          <w:sz w:val="28"/>
+          <w:szCs w:val="28"/>
+        </w:rPr>
+        <w:t>Appointments</w:t>
       </w:r>
     </w:p>
     <w:p>
@@ -915,15 +915,17 @@
           <w:sz w:val="14"/>
           <w:szCs w:val="14"/>
         </w:rPr>
-        <w:t xml:space="preserve">       </w:t>
-      </w:r>
-      <w:r>
-        <w:rPr>
-          <w:rFonts w:ascii="Calibri" w:eastAsia="Calibri" w:hAnsi="Calibri" w:cs="Calibri"/>
-          <w:sz w:val="28"/>
-          <w:szCs w:val="28"/>
-        </w:rPr>
-        <w:t xml:space="preserve"> Login / Register</w:t>
+        <w:t xml:space="preserve">      </w:t>
+      </w:r>
+      <w:bookmarkStart w:id="11" w:name="_GoBack"/>
+      <w:bookmarkEnd w:id="11"/>
+      <w:r>
+        <w:rPr>
+          <w:rFonts w:ascii="Calibri" w:eastAsia="Calibri" w:hAnsi="Calibri" w:cs="Calibri"/>
+          <w:sz w:val="28"/>
+          <w:szCs w:val="28"/>
+        </w:rPr>
+        <w:t>Login / Register</w:t>
       </w:r>
     </w:p>
     <w:p>
@@ -3691,8 +3693,8 @@
           <w:szCs w:val="26"/>
         </w:rPr>
       </w:pPr>
-      <w:bookmarkStart w:id="11" w:name="_tzxmuhgtkqsm" w:colFirst="0" w:colLast="0"/>
-      <w:bookmarkEnd w:id="11"/>
+      <w:bookmarkStart w:id="12" w:name="_tzxmuhgtkqsm" w:colFirst="0" w:colLast="0"/>
+      <w:bookmarkEnd w:id="12"/>
     </w:p>
     <w:p>
       <w:pPr>
@@ -4478,8 +4480,8 @@
           <w:szCs w:val="26"/>
         </w:rPr>
       </w:pPr>
-      <w:bookmarkStart w:id="12" w:name="_wd0euwud2g5p" w:colFirst="0" w:colLast="0"/>
-      <w:bookmarkEnd w:id="12"/>
+      <w:bookmarkStart w:id="13" w:name="_wd0euwud2g5p" w:colFirst="0" w:colLast="0"/>
+      <w:bookmarkEnd w:id="13"/>
       <w:r>
         <w:rPr>
           <w:rFonts w:ascii="Calibri" w:eastAsia="Calibri" w:hAnsi="Calibri" w:cs="Calibri"/>
@@ -5054,10 +5056,10 @@
           <w:szCs w:val="26"/>
         </w:rPr>
       </w:pPr>
-      <w:bookmarkStart w:id="13" w:name="_b0vg0embxil4" w:colFirst="0" w:colLast="0"/>
-      <w:bookmarkStart w:id="14" w:name="_nhkchvud21py" w:colFirst="0" w:colLast="0"/>
-      <w:bookmarkEnd w:id="13"/>
+      <w:bookmarkStart w:id="14" w:name="_b0vg0embxil4" w:colFirst="0" w:colLast="0"/>
+      <w:bookmarkStart w:id="15" w:name="_nhkchvud21py" w:colFirst="0" w:colLast="0"/>
       <w:bookmarkEnd w:id="14"/>
+      <w:bookmarkEnd w:id="15"/>
     </w:p>
     <w:p/>
     <w:p>
@@ -5077,8 +5079,8 @@
           <w:szCs w:val="26"/>
         </w:rPr>
       </w:pPr>
-      <w:bookmarkStart w:id="15" w:name="_hq6zfeaz4nml" w:colFirst="0" w:colLast="0"/>
-      <w:bookmarkEnd w:id="15"/>
+      <w:bookmarkStart w:id="16" w:name="_hq6zfeaz4nml" w:colFirst="0" w:colLast="0"/>
+      <w:bookmarkEnd w:id="16"/>
     </w:p>
     <w:p>
       <w:pPr>
@@ -5660,8 +5662,8 @@
           <w:szCs w:val="26"/>
         </w:rPr>
       </w:pPr>
-      <w:bookmarkStart w:id="16" w:name="_7onpl7b9x6t0" w:colFirst="0" w:colLast="0"/>
-      <w:bookmarkEnd w:id="16"/>
+      <w:bookmarkStart w:id="17" w:name="_7onpl7b9x6t0" w:colFirst="0" w:colLast="0"/>
+      <w:bookmarkEnd w:id="17"/>
       <w:r>
         <w:rPr>
           <w:rFonts w:ascii="Calibri" w:eastAsia="Calibri" w:hAnsi="Calibri" w:cs="Calibri"/>
@@ -6232,8 +6234,8 @@
           <w:szCs w:val="26"/>
         </w:rPr>
       </w:pPr>
-      <w:bookmarkStart w:id="17" w:name="_8lk1l6lgu591" w:colFirst="0" w:colLast="0"/>
-      <w:bookmarkEnd w:id="17"/>
+      <w:bookmarkStart w:id="18" w:name="_8lk1l6lgu591" w:colFirst="0" w:colLast="0"/>
+      <w:bookmarkEnd w:id="18"/>
     </w:p>
     <w:p>
       <w:pPr>
@@ -6793,8 +6795,8 @@
           <w:szCs w:val="26"/>
         </w:rPr>
       </w:pPr>
-      <w:bookmarkStart w:id="18" w:name="_gaagfxwex4dt" w:colFirst="0" w:colLast="0"/>
-      <w:bookmarkEnd w:id="18"/>
+      <w:bookmarkStart w:id="19" w:name="_gaagfxwex4dt" w:colFirst="0" w:colLast="0"/>
+      <w:bookmarkEnd w:id="19"/>
       <w:r>
         <w:rPr>
           <w:rFonts w:ascii="Calibri" w:eastAsia="Calibri" w:hAnsi="Calibri" w:cs="Calibri"/>
@@ -7280,8 +7282,8 @@
           <w:szCs w:val="26"/>
         </w:rPr>
       </w:pPr>
-      <w:bookmarkStart w:id="19" w:name="_xjl1kerx0f25" w:colFirst="0" w:colLast="0"/>
-      <w:bookmarkEnd w:id="19"/>
+      <w:bookmarkStart w:id="20" w:name="_xjl1kerx0f25" w:colFirst="0" w:colLast="0"/>
+      <w:bookmarkEnd w:id="20"/>
     </w:p>
     <w:p>
       <w:pPr>
@@ -8859,8 +8861,8 @@
           <w:szCs w:val="28"/>
         </w:rPr>
       </w:pPr>
-      <w:bookmarkStart w:id="20" w:name="_o3ha47vpoy7f" w:colFirst="0" w:colLast="0"/>
-      <w:bookmarkEnd w:id="20"/>
+      <w:bookmarkStart w:id="21" w:name="_o3ha47vpoy7f" w:colFirst="0" w:colLast="0"/>
+      <w:bookmarkEnd w:id="21"/>
     </w:p>
     <w:p>
       <w:pPr>
@@ -9352,8 +9354,8 @@
           <w:szCs w:val="28"/>
         </w:rPr>
       </w:pPr>
-      <w:bookmarkStart w:id="21" w:name="_7ceh0v4jelp9" w:colFirst="0" w:colLast="0"/>
-      <w:bookmarkEnd w:id="21"/>
+      <w:bookmarkStart w:id="22" w:name="_7ceh0v4jelp9" w:colFirst="0" w:colLast="0"/>
+      <w:bookmarkEnd w:id="22"/>
       <w:r>
         <w:rPr>
           <w:rFonts w:ascii="Calibri" w:eastAsia="Calibri" w:hAnsi="Calibri" w:cs="Calibri"/>
@@ -10072,8 +10074,8 @@
           <w:color w:val="000000"/>
         </w:rPr>
       </w:pPr>
-      <w:bookmarkStart w:id="22" w:name="_guobguxdp44y" w:colFirst="0" w:colLast="0"/>
-      <w:bookmarkEnd w:id="22"/>
+      <w:bookmarkStart w:id="23" w:name="_guobguxdp44y" w:colFirst="0" w:colLast="0"/>
+      <w:bookmarkEnd w:id="23"/>
       <w:r>
         <w:rPr>
           <w:rFonts w:ascii="Calibri" w:eastAsia="Calibri" w:hAnsi="Calibri" w:cs="Calibri"/>
@@ -10091,8 +10093,8 @@
         <w:keepLines w:val="0"/>
         <w:spacing w:before="0" w:after="0" w:line="360" w:lineRule="auto"/>
       </w:pPr>
-      <w:bookmarkStart w:id="23" w:name="_2uz1qtdbcjmj" w:colFirst="0" w:colLast="0"/>
-      <w:bookmarkEnd w:id="23"/>
+      <w:bookmarkStart w:id="24" w:name="_2uz1qtdbcjmj" w:colFirst="0" w:colLast="0"/>
+      <w:bookmarkEnd w:id="24"/>
       <w:r>
         <w:rPr>
           <w:rFonts w:ascii="Calibri" w:eastAsia="Calibri" w:hAnsi="Calibri" w:cs="Calibri"/>
@@ -10408,8 +10410,6 @@
           <w:szCs w:val="28"/>
         </w:rPr>
       </w:pPr>
-      <w:bookmarkStart w:id="24" w:name="_GoBack"/>
-      <w:bookmarkEnd w:id="24"/>
     </w:p>
     <w:p>
       <w:pPr>

</xml_diff>